<commit_message>
Moved C++ documentation to Documentation folder
</commit_message>
<xml_diff>
--- a/Documentation/c++_report.docx
+++ b/Documentation/c++_report.docx
@@ -174,16 +174,7 @@
           <w:sz w:val="32"/>
           <w:szCs w:val="32"/>
         </w:rPr>
-        <w:t>B</w:t>
-      </w:r>
-      <w:r>
-        <w:rPr>
-          <w:rFonts w:ascii="Aptos" w:hAnsi="Aptos" w:cs="Arial"/>
-          <w:color w:val="000000"/>
-          <w:sz w:val="32"/>
-          <w:szCs w:val="32"/>
-        </w:rPr>
-        <w:t>y</w:t>
+        <w:t>By</w:t>
       </w:r>
     </w:p>
     <w:p>
@@ -326,59 +317,47 @@
     </w:p>
     <w:p>
       <w:pPr>
-        <w:rPr>
-          <w:rFonts w:ascii="Aptos" w:hAnsi="Aptos"/>
-          <w:color w:val="000000" w:themeColor="text1"/>
-          <w:sz w:val="24"/>
-          <w:szCs w:val="24"/>
+        <w:pStyle w:val="NormalWeb"/>
+        <w:spacing w:line="276" w:lineRule="auto"/>
+        <w:rPr>
+          <w:rFonts w:ascii="Aptos" w:hAnsi="Aptos"/>
         </w:rPr>
       </w:pPr>
       <w:r>
         <w:rPr>
           <w:rFonts w:ascii="Aptos" w:hAnsi="Aptos"/>
-          <w:color w:val="000000" w:themeColor="text1"/>
-          <w:sz w:val="24"/>
-          <w:szCs w:val="24"/>
-        </w:rPr>
-        <w:t xml:space="preserve">The Student Scholarship Management System is a C++ application designed to determine whether a student is eligible for a scholarship based on predefined criteria such as academic performance and family income. </w:t>
+        </w:rPr>
+        <w:t>The Student Scholarship Management System is a C++ based application developed to manage student scholarship eligibility based on academic marks and family income.</w:t>
       </w:r>
     </w:p>
     <w:p>
       <w:pPr>
-        <w:rPr>
-          <w:rFonts w:ascii="Aptos" w:hAnsi="Aptos"/>
-          <w:color w:val="000000" w:themeColor="text1"/>
-          <w:sz w:val="24"/>
-          <w:szCs w:val="24"/>
+        <w:pStyle w:val="NormalWeb"/>
+        <w:spacing w:line="276" w:lineRule="auto"/>
+        <w:rPr>
+          <w:rFonts w:ascii="Aptos" w:hAnsi="Aptos"/>
         </w:rPr>
       </w:pPr>
       <w:r>
         <w:rPr>
           <w:rFonts w:ascii="Aptos" w:hAnsi="Aptos"/>
-          <w:color w:val="000000" w:themeColor="text1"/>
-          <w:sz w:val="24"/>
-          <w:szCs w:val="24"/>
-        </w:rPr>
-        <w:t>The system collects student information, verifies eligibility using conditional logic, and allocates the appropriate scholarship amount. It also stores the student details and scholarship information in a text file using file handling, allowing records to be maintained permanently.</w:t>
+        </w:rPr>
+        <w:t>The system allows users to add student details, automatically calculate scholarship eligibility, store the information permanently using file handling, display all stored student records, and search for a specific student by name.</w:t>
       </w:r>
     </w:p>
     <w:p>
       <w:pPr>
-        <w:rPr>
-          <w:rFonts w:ascii="Aptos" w:hAnsi="Aptos"/>
-          <w:color w:val="000000" w:themeColor="text1"/>
-          <w:sz w:val="24"/>
-          <w:szCs w:val="24"/>
+        <w:pStyle w:val="NormalWeb"/>
+        <w:spacing w:line="276" w:lineRule="auto"/>
+        <w:rPr>
+          <w:rFonts w:ascii="Aptos" w:hAnsi="Aptos"/>
         </w:rPr>
       </w:pPr>
       <w:r>
         <w:rPr>
           <w:rFonts w:ascii="Aptos" w:hAnsi="Aptos"/>
-          <w:color w:val="000000" w:themeColor="text1"/>
-          <w:sz w:val="24"/>
-          <w:szCs w:val="24"/>
-        </w:rPr>
-        <w:t>This project demonstrates the use of Object-Oriented Programming concepts, conditional statements, menu-driven programs, and file handling in C++.</w:t>
+        </w:rPr>
+        <w:t>The project demonstrates the use of Object-Oriented Programming, conditional logic, menu-driven programs, and file handling in C++.</w:t>
       </w:r>
     </w:p>
     <w:p>
@@ -403,104 +382,97 @@
     </w:p>
     <w:p>
       <w:pPr>
-        <w:rPr>
-          <w:rFonts w:ascii="Aptos" w:hAnsi="Aptos"/>
-          <w:color w:val="000000" w:themeColor="text1"/>
-          <w:sz w:val="24"/>
-          <w:szCs w:val="24"/>
+        <w:pStyle w:val="NormalWeb"/>
+        <w:numPr>
+          <w:ilvl w:val="0"/>
+          <w:numId w:val="13"/>
+        </w:numPr>
+        <w:spacing w:line="360" w:lineRule="auto"/>
+        <w:rPr>
+          <w:rFonts w:ascii="Aptos" w:hAnsi="Aptos"/>
         </w:rPr>
       </w:pPr>
       <w:r>
         <w:rPr>
           <w:rFonts w:ascii="Aptos" w:hAnsi="Aptos"/>
-          <w:color w:val="000000" w:themeColor="text1"/>
-        </w:rPr>
-        <w:t xml:space="preserve">• </w:t>
-      </w:r>
-      <w:r>
-        <w:rPr>
-          <w:rFonts w:ascii="Aptos" w:hAnsi="Aptos"/>
-          <w:color w:val="000000" w:themeColor="text1"/>
-          <w:sz w:val="24"/>
-          <w:szCs w:val="24"/>
-        </w:rPr>
-        <w:t>To design a system that verifies student scholarship eligibility</w:t>
+        </w:rPr>
+        <w:t>To determine scholarship eligibility based on marks and family income</w:t>
       </w:r>
     </w:p>
     <w:p>
       <w:pPr>
-        <w:rPr>
-          <w:rFonts w:ascii="Aptos" w:hAnsi="Aptos"/>
-          <w:color w:val="000000" w:themeColor="text1"/>
-          <w:sz w:val="24"/>
-          <w:szCs w:val="24"/>
+        <w:pStyle w:val="NormalWeb"/>
+        <w:numPr>
+          <w:ilvl w:val="0"/>
+          <w:numId w:val="13"/>
+        </w:numPr>
+        <w:spacing w:line="360" w:lineRule="auto"/>
+        <w:rPr>
+          <w:rFonts w:ascii="Aptos" w:hAnsi="Aptos"/>
         </w:rPr>
       </w:pPr>
       <w:r>
         <w:rPr>
           <w:rFonts w:ascii="Aptos" w:hAnsi="Aptos"/>
-          <w:color w:val="000000" w:themeColor="text1"/>
-          <w:sz w:val="24"/>
-          <w:szCs w:val="24"/>
-        </w:rPr>
-        <w:t>• To implement decision-making logic using conditional statements</w:t>
+        </w:rPr>
+        <w:t>To store student records using file handling</w:t>
       </w:r>
     </w:p>
     <w:p>
       <w:pPr>
-        <w:rPr>
-          <w:rFonts w:ascii="Aptos" w:hAnsi="Aptos"/>
-          <w:color w:val="000000" w:themeColor="text1"/>
-          <w:sz w:val="24"/>
-          <w:szCs w:val="24"/>
+        <w:pStyle w:val="NormalWeb"/>
+        <w:numPr>
+          <w:ilvl w:val="0"/>
+          <w:numId w:val="13"/>
+        </w:numPr>
+        <w:spacing w:line="360" w:lineRule="auto"/>
+        <w:rPr>
+          <w:rFonts w:ascii="Aptos" w:hAnsi="Aptos"/>
         </w:rPr>
       </w:pPr>
       <w:r>
         <w:rPr>
           <w:rFonts w:ascii="Aptos" w:hAnsi="Aptos"/>
-          <w:color w:val="000000" w:themeColor="text1"/>
-          <w:sz w:val="24"/>
-          <w:szCs w:val="24"/>
-        </w:rPr>
-        <w:t>• To apply Object-Oriented Programming (OOP) concepts</w:t>
+        </w:rPr>
+        <w:t>To display all stored student records</w:t>
       </w:r>
     </w:p>
     <w:p>
       <w:pPr>
-        <w:rPr>
-          <w:rFonts w:ascii="Aptos" w:hAnsi="Aptos"/>
-          <w:color w:val="000000" w:themeColor="text1"/>
-          <w:sz w:val="24"/>
-          <w:szCs w:val="24"/>
+        <w:pStyle w:val="NormalWeb"/>
+        <w:numPr>
+          <w:ilvl w:val="0"/>
+          <w:numId w:val="13"/>
+        </w:numPr>
+        <w:spacing w:line="360" w:lineRule="auto"/>
+        <w:rPr>
+          <w:rFonts w:ascii="Aptos" w:hAnsi="Aptos"/>
         </w:rPr>
       </w:pPr>
       <w:r>
         <w:rPr>
           <w:rFonts w:ascii="Aptos" w:hAnsi="Aptos"/>
-          <w:color w:val="000000" w:themeColor="text1"/>
-          <w:sz w:val="24"/>
-          <w:szCs w:val="24"/>
-        </w:rPr>
-        <w:t>• To implement file handling to store student records</w:t>
+        </w:rPr>
+        <w:t>To search for a specific student by name</w:t>
       </w:r>
     </w:p>
     <w:p>
       <w:pPr>
-        <w:rPr>
-          <w:rFonts w:ascii="Aptos" w:hAnsi="Aptos"/>
-          <w:color w:val="000000" w:themeColor="text1"/>
-          <w:sz w:val="24"/>
-          <w:szCs w:val="24"/>
+        <w:pStyle w:val="NormalWeb"/>
+        <w:numPr>
+          <w:ilvl w:val="0"/>
+          <w:numId w:val="13"/>
+        </w:numPr>
+        <w:spacing w:line="360" w:lineRule="auto"/>
+        <w:rPr>
+          <w:rFonts w:ascii="Aptos" w:hAnsi="Aptos"/>
         </w:rPr>
       </w:pPr>
       <w:r>
         <w:rPr>
           <w:rFonts w:ascii="Aptos" w:hAnsi="Aptos"/>
-          <w:color w:val="000000" w:themeColor="text1"/>
-          <w:sz w:val="24"/>
-          <w:szCs w:val="24"/>
-        </w:rPr>
-        <w:t>• To create a menu-driven application for easy user interaction</w:t>
+        </w:rPr>
+        <w:t>To demonstrate Object-Oriented Programming concepts in C++</w:t>
       </w:r>
     </w:p>
     <w:p>
@@ -596,6 +568,7 @@
           <w:sz w:val="24"/>
           <w:szCs w:val="24"/>
         </w:rPr>
+        <w:lastRenderedPageBreak/>
         <w:t>• Any standard processor</w:t>
       </w:r>
     </w:p>
@@ -608,16 +581,6 @@
           <w:szCs w:val="24"/>
         </w:rPr>
       </w:pPr>
-    </w:p>
-    <w:p>
-      <w:pPr>
-        <w:rPr>
-          <w:rFonts w:ascii="Aptos" w:hAnsi="Aptos"/>
-          <w:color w:val="000000" w:themeColor="text1"/>
-          <w:sz w:val="24"/>
-          <w:szCs w:val="24"/>
-        </w:rPr>
-      </w:pPr>
       <w:r>
         <w:rPr>
           <w:rFonts w:ascii="Aptos" w:hAnsi="Aptos"/>
@@ -707,142 +670,167 @@
     </w:p>
     <w:p>
       <w:pPr>
-        <w:rPr>
-          <w:rFonts w:ascii="Aptos" w:hAnsi="Aptos"/>
-          <w:color w:val="000000" w:themeColor="text1"/>
-          <w:sz w:val="24"/>
-          <w:szCs w:val="24"/>
+        <w:pStyle w:val="NormalWeb"/>
+        <w:numPr>
+          <w:ilvl w:val="0"/>
+          <w:numId w:val="14"/>
+        </w:numPr>
+        <w:spacing w:line="360" w:lineRule="auto"/>
+        <w:rPr>
+          <w:rFonts w:ascii="Aptos" w:hAnsi="Aptos"/>
         </w:rPr>
       </w:pPr>
       <w:r>
         <w:rPr>
           <w:rFonts w:ascii="Aptos" w:hAnsi="Aptos"/>
-          <w:color w:val="000000" w:themeColor="text1"/>
-        </w:rPr>
-        <w:t>1</w:t>
-      </w:r>
-      <w:r>
-        <w:rPr>
-          <w:rFonts w:ascii="Aptos" w:hAnsi="Aptos"/>
-          <w:color w:val="000000" w:themeColor="text1"/>
-          <w:sz w:val="24"/>
-          <w:szCs w:val="24"/>
-        </w:rPr>
-        <w:t>. The user runs the program.</w:t>
+        </w:rPr>
+        <w:t>The program displays a menu-driven interface.</w:t>
       </w:r>
     </w:p>
     <w:p>
       <w:pPr>
-        <w:rPr>
-          <w:rFonts w:ascii="Aptos" w:hAnsi="Aptos"/>
-          <w:color w:val="000000" w:themeColor="text1"/>
-          <w:sz w:val="24"/>
-          <w:szCs w:val="24"/>
+        <w:pStyle w:val="NormalWeb"/>
+        <w:numPr>
+          <w:ilvl w:val="0"/>
+          <w:numId w:val="14"/>
+        </w:numPr>
+        <w:spacing w:line="360" w:lineRule="auto"/>
+        <w:rPr>
+          <w:rFonts w:ascii="Aptos" w:hAnsi="Aptos"/>
         </w:rPr>
       </w:pPr>
       <w:r>
         <w:rPr>
           <w:rFonts w:ascii="Aptos" w:hAnsi="Aptos"/>
-          <w:color w:val="000000" w:themeColor="text1"/>
-          <w:sz w:val="24"/>
-          <w:szCs w:val="24"/>
-        </w:rPr>
-        <w:t>2. A menu-driven interface appears.</w:t>
+        </w:rPr>
+        <w:t>The user selects an option from the menu.</w:t>
       </w:r>
     </w:p>
     <w:p>
       <w:pPr>
-        <w:rPr>
-          <w:rFonts w:ascii="Aptos" w:hAnsi="Aptos"/>
-          <w:color w:val="000000" w:themeColor="text1"/>
-          <w:sz w:val="24"/>
-          <w:szCs w:val="24"/>
+        <w:pStyle w:val="NormalWeb"/>
+        <w:numPr>
+          <w:ilvl w:val="0"/>
+          <w:numId w:val="14"/>
+        </w:numPr>
+        <w:spacing w:line="360" w:lineRule="auto"/>
+        <w:rPr>
+          <w:rFonts w:ascii="Aptos" w:hAnsi="Aptos"/>
         </w:rPr>
       </w:pPr>
       <w:r>
         <w:rPr>
           <w:rFonts w:ascii="Aptos" w:hAnsi="Aptos"/>
-          <w:color w:val="000000" w:themeColor="text1"/>
-          <w:sz w:val="24"/>
-          <w:szCs w:val="24"/>
-        </w:rPr>
-        <w:t>3. The user enters student details such as name, marks, and family income.</w:t>
+        </w:rPr>
+        <w:t xml:space="preserve">If </w:t>
+      </w:r>
+      <w:r>
+        <w:rPr>
+          <w:rStyle w:val="Strong"/>
+          <w:rFonts w:ascii="Aptos" w:hAnsi="Aptos"/>
+        </w:rPr>
+        <w:t>Add Student</w:t>
+      </w:r>
+      <w:r>
+        <w:rPr>
+          <w:rFonts w:ascii="Aptos" w:hAnsi="Aptos"/>
+        </w:rPr>
+        <w:t xml:space="preserve"> is selected, the user enters student details.</w:t>
       </w:r>
     </w:p>
     <w:p>
       <w:pPr>
-        <w:rPr>
-          <w:rFonts w:ascii="Aptos" w:hAnsi="Aptos"/>
-          <w:color w:val="000000" w:themeColor="text1"/>
-          <w:sz w:val="24"/>
-          <w:szCs w:val="24"/>
+        <w:pStyle w:val="NormalWeb"/>
+        <w:numPr>
+          <w:ilvl w:val="0"/>
+          <w:numId w:val="14"/>
+        </w:numPr>
+        <w:spacing w:line="360" w:lineRule="auto"/>
+        <w:rPr>
+          <w:rFonts w:ascii="Aptos" w:hAnsi="Aptos"/>
         </w:rPr>
       </w:pPr>
       <w:r>
         <w:rPr>
           <w:rFonts w:ascii="Aptos" w:hAnsi="Aptos"/>
-          <w:color w:val="000000" w:themeColor="text1"/>
-          <w:sz w:val="24"/>
-          <w:szCs w:val="24"/>
-        </w:rPr>
-        <w:t>4. The program checks eligibility based on predefined criteria.</w:t>
+        </w:rPr>
+        <w:t>The system automatically calculates scholarship eligibility.</w:t>
       </w:r>
     </w:p>
     <w:p>
       <w:pPr>
-        <w:rPr>
-          <w:rFonts w:ascii="Aptos" w:hAnsi="Aptos"/>
-          <w:color w:val="000000" w:themeColor="text1"/>
-          <w:sz w:val="24"/>
-          <w:szCs w:val="24"/>
+        <w:pStyle w:val="NormalWeb"/>
+        <w:numPr>
+          <w:ilvl w:val="0"/>
+          <w:numId w:val="14"/>
+        </w:numPr>
+        <w:spacing w:line="360" w:lineRule="auto"/>
+        <w:rPr>
+          <w:rFonts w:ascii="Aptos" w:hAnsi="Aptos"/>
         </w:rPr>
       </w:pPr>
       <w:r>
         <w:rPr>
           <w:rFonts w:ascii="Aptos" w:hAnsi="Aptos"/>
-          <w:color w:val="000000" w:themeColor="text1"/>
-          <w:sz w:val="24"/>
-          <w:szCs w:val="24"/>
-        </w:rPr>
-        <w:t>5. The scholarship amount is calculated.</w:t>
+        </w:rPr>
+        <w:t>Student data is stored in a text file.</w:t>
       </w:r>
     </w:p>
     <w:p>
       <w:pPr>
-        <w:rPr>
-          <w:rFonts w:ascii="Aptos" w:hAnsi="Aptos"/>
-          <w:color w:val="000000" w:themeColor="text1"/>
-          <w:sz w:val="24"/>
-          <w:szCs w:val="24"/>
+        <w:pStyle w:val="NormalWeb"/>
+        <w:numPr>
+          <w:ilvl w:val="0"/>
+          <w:numId w:val="14"/>
+        </w:numPr>
+        <w:spacing w:line="360" w:lineRule="auto"/>
+        <w:rPr>
+          <w:rFonts w:ascii="Aptos" w:hAnsi="Aptos"/>
         </w:rPr>
       </w:pPr>
       <w:r>
         <w:rPr>
           <w:rFonts w:ascii="Aptos" w:hAnsi="Aptos"/>
-          <w:color w:val="000000" w:themeColor="text1"/>
-          <w:sz w:val="24"/>
-          <w:szCs w:val="24"/>
-        </w:rPr>
-        <w:t>6. Student details and scholarship status are stored in a file.</w:t>
+        </w:rPr>
+        <w:t>The user can view all stored student records.</w:t>
       </w:r>
     </w:p>
     <w:p>
       <w:pPr>
-        <w:rPr>
-          <w:rFonts w:ascii="Aptos" w:hAnsi="Aptos"/>
-          <w:color w:val="000000" w:themeColor="text1"/>
-          <w:sz w:val="24"/>
-          <w:szCs w:val="24"/>
+        <w:pStyle w:val="NormalWeb"/>
+        <w:numPr>
+          <w:ilvl w:val="0"/>
+          <w:numId w:val="14"/>
+        </w:numPr>
+        <w:spacing w:line="360" w:lineRule="auto"/>
+        <w:rPr>
+          <w:rFonts w:ascii="Aptos" w:hAnsi="Aptos"/>
         </w:rPr>
       </w:pPr>
       <w:r>
         <w:rPr>
           <w:rFonts w:ascii="Aptos" w:hAnsi="Aptos"/>
-          <w:color w:val="000000" w:themeColor="text1"/>
-          <w:sz w:val="24"/>
-          <w:szCs w:val="24"/>
-        </w:rPr>
-        <w:t>7. The user can view the scholarship status from the menu.</w:t>
+        </w:rPr>
+        <w:t>The user can search for a student by name.</w:t>
+      </w:r>
+    </w:p>
+    <w:p>
+      <w:pPr>
+        <w:pStyle w:val="NormalWeb"/>
+        <w:numPr>
+          <w:ilvl w:val="0"/>
+          <w:numId w:val="14"/>
+        </w:numPr>
+        <w:spacing w:line="360" w:lineRule="auto"/>
+        <w:rPr>
+          <w:rFonts w:ascii="Aptos" w:hAnsi="Aptos"/>
+        </w:rPr>
+      </w:pPr>
+      <w:r>
+        <w:rPr>
+          <w:rFonts w:ascii="Aptos" w:hAnsi="Aptos"/>
+        </w:rPr>
+        <w:t>The program runs until the user selects Exit.</w:t>
       </w:r>
     </w:p>
     <w:p>
@@ -1021,117 +1009,117 @@
     </w:p>
     <w:p>
       <w:pPr>
-        <w:rPr>
-          <w:rFonts w:ascii="Aptos" w:hAnsi="Aptos"/>
-          <w:color w:val="000000" w:themeColor="text1"/>
-          <w:sz w:val="24"/>
-          <w:szCs w:val="24"/>
+        <w:pStyle w:val="NormalWeb"/>
+        <w:numPr>
+          <w:ilvl w:val="0"/>
+          <w:numId w:val="15"/>
+        </w:numPr>
+        <w:spacing w:line="360" w:lineRule="auto"/>
+        <w:rPr>
+          <w:rFonts w:ascii="Aptos" w:hAnsi="Aptos"/>
         </w:rPr>
       </w:pPr>
       <w:r>
         <w:rPr>
           <w:rFonts w:ascii="Aptos" w:hAnsi="Aptos"/>
-          <w:color w:val="000000" w:themeColor="text1"/>
-          <w:sz w:val="24"/>
-          <w:szCs w:val="24"/>
-        </w:rPr>
-        <w:t>• Menu-driven program</w:t>
+        </w:rPr>
+        <w:t>Menu-driven interface</w:t>
       </w:r>
     </w:p>
     <w:p>
       <w:pPr>
-        <w:rPr>
-          <w:rFonts w:ascii="Aptos" w:hAnsi="Aptos"/>
-          <w:color w:val="000000" w:themeColor="text1"/>
-          <w:sz w:val="24"/>
-          <w:szCs w:val="24"/>
+        <w:pStyle w:val="NormalWeb"/>
+        <w:numPr>
+          <w:ilvl w:val="0"/>
+          <w:numId w:val="15"/>
+        </w:numPr>
+        <w:spacing w:line="360" w:lineRule="auto"/>
+        <w:rPr>
+          <w:rFonts w:ascii="Aptos" w:hAnsi="Aptos"/>
         </w:rPr>
       </w:pPr>
       <w:r>
         <w:rPr>
           <w:rFonts w:ascii="Aptos" w:hAnsi="Aptos"/>
-          <w:color w:val="000000" w:themeColor="text1"/>
-          <w:sz w:val="24"/>
-          <w:szCs w:val="24"/>
-        </w:rPr>
-        <w:t>• Object-Oriented design using classes</w:t>
+        </w:rPr>
+        <w:lastRenderedPageBreak/>
+        <w:t>Automatic scholarship calculation</w:t>
       </w:r>
     </w:p>
     <w:p>
       <w:pPr>
-        <w:rPr>
-          <w:rFonts w:ascii="Aptos" w:hAnsi="Aptos"/>
-          <w:color w:val="000000" w:themeColor="text1"/>
-          <w:sz w:val="24"/>
-          <w:szCs w:val="24"/>
+        <w:pStyle w:val="NormalWeb"/>
+        <w:numPr>
+          <w:ilvl w:val="0"/>
+          <w:numId w:val="15"/>
+        </w:numPr>
+        <w:spacing w:line="360" w:lineRule="auto"/>
+        <w:rPr>
+          <w:rFonts w:ascii="Aptos" w:hAnsi="Aptos"/>
         </w:rPr>
       </w:pPr>
       <w:r>
         <w:rPr>
           <w:rFonts w:ascii="Aptos" w:hAnsi="Aptos"/>
-          <w:color w:val="000000" w:themeColor="text1"/>
-          <w:sz w:val="24"/>
-          <w:szCs w:val="24"/>
-        </w:rPr>
-        <w:lastRenderedPageBreak/>
-        <w:t>• Scholarship eligibility verification</w:t>
+        </w:rPr>
+        <w:t>File storage for student records</w:t>
       </w:r>
     </w:p>
     <w:p>
       <w:pPr>
-        <w:rPr>
-          <w:rFonts w:ascii="Aptos" w:hAnsi="Aptos"/>
-          <w:color w:val="000000" w:themeColor="text1"/>
-          <w:sz w:val="24"/>
-          <w:szCs w:val="24"/>
+        <w:pStyle w:val="NormalWeb"/>
+        <w:numPr>
+          <w:ilvl w:val="0"/>
+          <w:numId w:val="15"/>
+        </w:numPr>
+        <w:spacing w:line="360" w:lineRule="auto"/>
+        <w:rPr>
+          <w:rFonts w:ascii="Aptos" w:hAnsi="Aptos"/>
         </w:rPr>
       </w:pPr>
       <w:r>
         <w:rPr>
           <w:rFonts w:ascii="Aptos" w:hAnsi="Aptos"/>
-          <w:color w:val="000000" w:themeColor="text1"/>
-          <w:sz w:val="24"/>
-          <w:szCs w:val="24"/>
-        </w:rPr>
-        <w:t>• Automatic scholarship calculation</w:t>
+        </w:rPr>
+        <w:t>Display all stored student records</w:t>
       </w:r>
     </w:p>
     <w:p>
       <w:pPr>
-        <w:rPr>
-          <w:rFonts w:ascii="Aptos" w:hAnsi="Aptos"/>
-          <w:color w:val="000000" w:themeColor="text1"/>
-          <w:sz w:val="24"/>
-          <w:szCs w:val="24"/>
+        <w:pStyle w:val="NormalWeb"/>
+        <w:numPr>
+          <w:ilvl w:val="0"/>
+          <w:numId w:val="15"/>
+        </w:numPr>
+        <w:spacing w:line="360" w:lineRule="auto"/>
+        <w:rPr>
+          <w:rFonts w:ascii="Aptos" w:hAnsi="Aptos"/>
         </w:rPr>
       </w:pPr>
       <w:r>
         <w:rPr>
           <w:rFonts w:ascii="Aptos" w:hAnsi="Aptos"/>
-          <w:color w:val="000000" w:themeColor="text1"/>
-          <w:sz w:val="24"/>
-          <w:szCs w:val="24"/>
-        </w:rPr>
-        <w:t>• File storage for student records</w:t>
+        </w:rPr>
+        <w:t>Search student by name</w:t>
       </w:r>
     </w:p>
     <w:p>
       <w:pPr>
-        <w:rPr>
-          <w:rFonts w:ascii="Aptos" w:hAnsi="Aptos"/>
-          <w:color w:val="000000" w:themeColor="text1"/>
-          <w:sz w:val="24"/>
-          <w:szCs w:val="24"/>
+        <w:pStyle w:val="NormalWeb"/>
+        <w:numPr>
+          <w:ilvl w:val="0"/>
+          <w:numId w:val="15"/>
+        </w:numPr>
+        <w:spacing w:line="360" w:lineRule="auto"/>
+        <w:rPr>
+          <w:rFonts w:ascii="Aptos" w:hAnsi="Aptos"/>
         </w:rPr>
       </w:pPr>
       <w:r>
         <w:rPr>
           <w:rFonts w:ascii="Aptos" w:hAnsi="Aptos"/>
-          <w:color w:val="000000" w:themeColor="text1"/>
-          <w:sz w:val="24"/>
-          <w:szCs w:val="24"/>
-        </w:rPr>
-        <w:t>• Multiple student entries supported</w:t>
+        </w:rPr>
+        <w:t>Object-Oriented Programming implementation</w:t>
       </w:r>
     </w:p>
     <w:p>
@@ -1473,232 +1461,358 @@
     </w:p>
     <w:p>
       <w:pPr>
-        <w:rPr>
-          <w:rFonts w:ascii="Aptos" w:hAnsi="Aptos"/>
-          <w:color w:val="000000" w:themeColor="text1"/>
-          <w:sz w:val="24"/>
-          <w:szCs w:val="24"/>
+        <w:pStyle w:val="NormalWeb"/>
+        <w:spacing w:line="360" w:lineRule="auto"/>
+        <w:rPr>
+          <w:rFonts w:ascii="Aptos" w:hAnsi="Aptos"/>
         </w:rPr>
       </w:pPr>
       <w:r>
         <w:rPr>
           <w:rFonts w:ascii="Aptos" w:hAnsi="Aptos"/>
-          <w:color w:val="000000" w:themeColor="text1"/>
-          <w:sz w:val="24"/>
-          <w:szCs w:val="24"/>
         </w:rPr>
         <w:t xml:space="preserve">The program uses a </w:t>
       </w:r>
-      <w:proofErr w:type="gramStart"/>
       <w:r>
         <w:rPr>
-          <w:rFonts w:ascii="Aptos" w:hAnsi="Aptos"/>
-          <w:color w:val="000000" w:themeColor="text1"/>
-          <w:sz w:val="24"/>
-          <w:szCs w:val="24"/>
-        </w:rPr>
-        <w:t>Student</w:t>
+          <w:rStyle w:val="Strong"/>
+          <w:rFonts w:ascii="Aptos" w:hAnsi="Aptos"/>
+        </w:rPr>
+        <w:t>Student class</w:t>
       </w:r>
-      <w:proofErr w:type="gramEnd"/>
       <w:r>
         <w:rPr>
           <w:rFonts w:ascii="Aptos" w:hAnsi="Aptos"/>
-          <w:color w:val="000000" w:themeColor="text1"/>
-          <w:sz w:val="24"/>
-          <w:szCs w:val="24"/>
-        </w:rPr>
-        <w:t xml:space="preserve"> class that contains:</w:t>
+        </w:rPr>
+        <w:t xml:space="preserve"> that contains:</w:t>
       </w:r>
     </w:p>
     <w:p>
       <w:pPr>
-        <w:rPr>
-          <w:rFonts w:ascii="Aptos" w:hAnsi="Aptos"/>
-          <w:color w:val="000000" w:themeColor="text1"/>
-          <w:sz w:val="24"/>
-          <w:szCs w:val="24"/>
+        <w:pStyle w:val="NormalWeb"/>
+        <w:spacing w:line="360" w:lineRule="auto"/>
+        <w:rPr>
+          <w:rFonts w:ascii="Aptos" w:hAnsi="Aptos"/>
         </w:rPr>
       </w:pPr>
       <w:r>
         <w:rPr>
-          <w:rFonts w:ascii="Aptos" w:hAnsi="Aptos"/>
-          <w:color w:val="000000" w:themeColor="text1"/>
-          <w:sz w:val="24"/>
-          <w:szCs w:val="24"/>
-        </w:rPr>
-        <w:t>Data Members:</w:t>
+          <w:rStyle w:val="Strong"/>
+          <w:rFonts w:ascii="Aptos" w:hAnsi="Aptos"/>
+        </w:rPr>
+        <w:t>Data Members</w:t>
       </w:r>
     </w:p>
     <w:p>
       <w:pPr>
-        <w:rPr>
-          <w:rFonts w:ascii="Aptos" w:hAnsi="Aptos"/>
-          <w:color w:val="000000" w:themeColor="text1"/>
-          <w:sz w:val="24"/>
-          <w:szCs w:val="24"/>
+        <w:pStyle w:val="NormalWeb"/>
+        <w:numPr>
+          <w:ilvl w:val="0"/>
+          <w:numId w:val="16"/>
+        </w:numPr>
+        <w:spacing w:line="360" w:lineRule="auto"/>
+        <w:rPr>
+          <w:rFonts w:ascii="Aptos" w:hAnsi="Aptos"/>
         </w:rPr>
       </w:pPr>
       <w:r>
         <w:rPr>
           <w:rFonts w:ascii="Aptos" w:hAnsi="Aptos"/>
-          <w:color w:val="000000" w:themeColor="text1"/>
-          <w:sz w:val="24"/>
-          <w:szCs w:val="24"/>
-        </w:rPr>
-        <w:t>• Name</w:t>
+        </w:rPr>
+        <w:lastRenderedPageBreak/>
+        <w:t>name</w:t>
       </w:r>
     </w:p>
     <w:p>
       <w:pPr>
-        <w:rPr>
-          <w:rFonts w:ascii="Aptos" w:hAnsi="Aptos"/>
-          <w:color w:val="000000" w:themeColor="text1"/>
-          <w:sz w:val="24"/>
-          <w:szCs w:val="24"/>
+        <w:pStyle w:val="NormalWeb"/>
+        <w:numPr>
+          <w:ilvl w:val="0"/>
+          <w:numId w:val="16"/>
+        </w:numPr>
+        <w:spacing w:line="360" w:lineRule="auto"/>
+        <w:rPr>
+          <w:rFonts w:ascii="Aptos" w:hAnsi="Aptos"/>
         </w:rPr>
       </w:pPr>
       <w:r>
         <w:rPr>
           <w:rFonts w:ascii="Aptos" w:hAnsi="Aptos"/>
-          <w:color w:val="000000" w:themeColor="text1"/>
-          <w:sz w:val="24"/>
-          <w:szCs w:val="24"/>
-        </w:rPr>
-        <w:lastRenderedPageBreak/>
-        <w:t>• Marks</w:t>
+        </w:rPr>
+        <w:t>marks</w:t>
       </w:r>
     </w:p>
     <w:p>
       <w:pPr>
-        <w:rPr>
-          <w:rFonts w:ascii="Aptos" w:hAnsi="Aptos"/>
-          <w:color w:val="000000" w:themeColor="text1"/>
-          <w:sz w:val="24"/>
-          <w:szCs w:val="24"/>
+        <w:pStyle w:val="NormalWeb"/>
+        <w:numPr>
+          <w:ilvl w:val="0"/>
+          <w:numId w:val="16"/>
+        </w:numPr>
+        <w:spacing w:line="360" w:lineRule="auto"/>
+        <w:rPr>
+          <w:rFonts w:ascii="Aptos" w:hAnsi="Aptos"/>
         </w:rPr>
       </w:pPr>
       <w:r>
         <w:rPr>
           <w:rFonts w:ascii="Aptos" w:hAnsi="Aptos"/>
-          <w:color w:val="000000" w:themeColor="text1"/>
-          <w:sz w:val="24"/>
-          <w:szCs w:val="24"/>
-        </w:rPr>
-        <w:t>• Income</w:t>
+        </w:rPr>
+        <w:t>income</w:t>
       </w:r>
     </w:p>
     <w:p>
       <w:pPr>
-        <w:rPr>
-          <w:rFonts w:ascii="Aptos" w:hAnsi="Aptos"/>
-          <w:color w:val="000000" w:themeColor="text1"/>
-          <w:sz w:val="24"/>
-          <w:szCs w:val="24"/>
+        <w:pStyle w:val="NormalWeb"/>
+        <w:numPr>
+          <w:ilvl w:val="0"/>
+          <w:numId w:val="16"/>
+        </w:numPr>
+        <w:spacing w:line="360" w:lineRule="auto"/>
+        <w:rPr>
+          <w:rFonts w:ascii="Aptos" w:hAnsi="Aptos"/>
         </w:rPr>
       </w:pPr>
       <w:r>
         <w:rPr>
           <w:rFonts w:ascii="Aptos" w:hAnsi="Aptos"/>
-          <w:color w:val="000000" w:themeColor="text1"/>
-          <w:sz w:val="24"/>
-          <w:szCs w:val="24"/>
-        </w:rPr>
-        <w:t>• Scholarship Amount</w:t>
+        </w:rPr>
+        <w:t>scholarship</w:t>
       </w:r>
     </w:p>
     <w:p>
       <w:pPr>
-        <w:rPr>
-          <w:rFonts w:ascii="Aptos" w:hAnsi="Aptos"/>
-          <w:color w:val="000000" w:themeColor="text1"/>
-          <w:sz w:val="24"/>
-          <w:szCs w:val="24"/>
+        <w:pStyle w:val="NormalWeb"/>
+        <w:spacing w:line="360" w:lineRule="auto"/>
+        <w:rPr>
+          <w:rFonts w:ascii="Aptos" w:hAnsi="Aptos"/>
         </w:rPr>
       </w:pPr>
       <w:r>
         <w:rPr>
-          <w:rFonts w:ascii="Aptos" w:hAnsi="Aptos"/>
-          <w:color w:val="000000" w:themeColor="text1"/>
-          <w:sz w:val="24"/>
-          <w:szCs w:val="24"/>
-        </w:rPr>
-        <w:t>Member Functions:</w:t>
+          <w:rStyle w:val="Strong"/>
+          <w:rFonts w:ascii="Aptos" w:hAnsi="Aptos"/>
+        </w:rPr>
+        <w:t>Member Functions</w:t>
       </w:r>
     </w:p>
     <w:p>
       <w:pPr>
-        <w:rPr>
-          <w:rFonts w:ascii="Aptos" w:hAnsi="Aptos"/>
-          <w:color w:val="000000" w:themeColor="text1"/>
+        <w:pStyle w:val="NormalWeb"/>
+        <w:numPr>
+          <w:ilvl w:val="0"/>
+          <w:numId w:val="17"/>
+        </w:numPr>
+        <w:spacing w:line="360" w:lineRule="auto"/>
+        <w:rPr>
+          <w:rFonts w:ascii="Aptos" w:hAnsi="Aptos"/>
+        </w:rPr>
+      </w:pPr>
+      <w:proofErr w:type="spellStart"/>
+      <w:r>
+        <w:rPr>
+          <w:rStyle w:val="HTMLCode"/>
+          <w:rFonts w:ascii="Aptos" w:hAnsi="Aptos"/>
           <w:sz w:val="24"/>
           <w:szCs w:val="24"/>
         </w:rPr>
-      </w:pPr>
+        <w:t>getDetails</w:t>
+      </w:r>
+      <w:proofErr w:type="spellEnd"/>
       <w:r>
         <w:rPr>
-          <w:rFonts w:ascii="Aptos" w:hAnsi="Aptos"/>
-          <w:color w:val="000000" w:themeColor="text1"/>
+          <w:rStyle w:val="HTMLCode"/>
+          <w:rFonts w:ascii="Aptos" w:hAnsi="Aptos"/>
           <w:sz w:val="24"/>
           <w:szCs w:val="24"/>
         </w:rPr>
-        <w:t>• getDetails() – Accept student details</w:t>
+        <w:t>()</w:t>
+      </w:r>
+      <w:r>
+        <w:rPr>
+          <w:rFonts w:ascii="Aptos" w:hAnsi="Aptos"/>
+          <w:sz w:val="36"/>
+          <w:szCs w:val="36"/>
+        </w:rPr>
+        <w:t xml:space="preserve"> </w:t>
+      </w:r>
+      <w:r>
+        <w:rPr>
+          <w:rFonts w:ascii="Aptos" w:hAnsi="Aptos"/>
+        </w:rPr>
+        <w:t>– accepts student information</w:t>
       </w:r>
     </w:p>
     <w:p>
       <w:pPr>
-        <w:rPr>
-          <w:rFonts w:ascii="Aptos" w:hAnsi="Aptos"/>
-          <w:color w:val="000000" w:themeColor="text1"/>
+        <w:pStyle w:val="NormalWeb"/>
+        <w:numPr>
+          <w:ilvl w:val="0"/>
+          <w:numId w:val="17"/>
+        </w:numPr>
+        <w:spacing w:line="360" w:lineRule="auto"/>
+        <w:rPr>
+          <w:rFonts w:ascii="Aptos" w:hAnsi="Aptos"/>
+        </w:rPr>
+      </w:pPr>
+      <w:proofErr w:type="spellStart"/>
+      <w:r>
+        <w:rPr>
+          <w:rStyle w:val="HTMLCode"/>
+          <w:rFonts w:ascii="Aptos" w:hAnsi="Aptos"/>
           <w:sz w:val="24"/>
           <w:szCs w:val="24"/>
         </w:rPr>
-      </w:pPr>
+        <w:t>checkEligibility</w:t>
+      </w:r>
+      <w:proofErr w:type="spellEnd"/>
       <w:r>
         <w:rPr>
-          <w:rFonts w:ascii="Aptos" w:hAnsi="Aptos"/>
-          <w:color w:val="000000" w:themeColor="text1"/>
+          <w:rStyle w:val="HTMLCode"/>
+          <w:rFonts w:ascii="Aptos" w:hAnsi="Aptos"/>
           <w:sz w:val="24"/>
           <w:szCs w:val="24"/>
         </w:rPr>
-        <w:t>• checkEligibility() – Determine scholarship eligibility</w:t>
+        <w:t>()</w:t>
+      </w:r>
+      <w:r>
+        <w:rPr>
+          <w:rFonts w:ascii="Aptos" w:hAnsi="Aptos"/>
+          <w:sz w:val="36"/>
+          <w:szCs w:val="36"/>
+        </w:rPr>
+        <w:t xml:space="preserve"> </w:t>
+      </w:r>
+      <w:r>
+        <w:rPr>
+          <w:rFonts w:ascii="Aptos" w:hAnsi="Aptos"/>
+        </w:rPr>
+        <w:t>– calculates scholarship eligibility</w:t>
       </w:r>
     </w:p>
     <w:p>
       <w:pPr>
-        <w:rPr>
-          <w:rFonts w:ascii="Aptos" w:hAnsi="Aptos"/>
-          <w:color w:val="000000" w:themeColor="text1"/>
+        <w:pStyle w:val="NormalWeb"/>
+        <w:numPr>
+          <w:ilvl w:val="0"/>
+          <w:numId w:val="17"/>
+        </w:numPr>
+        <w:spacing w:line="360" w:lineRule="auto"/>
+        <w:rPr>
+          <w:rFonts w:ascii="Aptos" w:hAnsi="Aptos"/>
+        </w:rPr>
+      </w:pPr>
+      <w:proofErr w:type="spellStart"/>
+      <w:r>
+        <w:rPr>
+          <w:rStyle w:val="HTMLCode"/>
+          <w:rFonts w:ascii="Aptos" w:hAnsi="Aptos"/>
           <w:sz w:val="24"/>
           <w:szCs w:val="24"/>
         </w:rPr>
-      </w:pPr>
+        <w:t>saveToFile</w:t>
+      </w:r>
+      <w:proofErr w:type="spellEnd"/>
       <w:r>
         <w:rPr>
-          <w:rFonts w:ascii="Aptos" w:hAnsi="Aptos"/>
-          <w:color w:val="000000" w:themeColor="text1"/>
+          <w:rStyle w:val="HTMLCode"/>
+          <w:rFonts w:ascii="Aptos" w:hAnsi="Aptos"/>
           <w:sz w:val="24"/>
           <w:szCs w:val="24"/>
         </w:rPr>
-        <w:t>• displayScholarship() – Display scholarship status</w:t>
+        <w:t>()</w:t>
+      </w:r>
+      <w:r>
+        <w:rPr>
+          <w:rFonts w:ascii="Aptos" w:hAnsi="Aptos"/>
+          <w:sz w:val="36"/>
+          <w:szCs w:val="36"/>
+        </w:rPr>
+        <w:t xml:space="preserve"> – </w:t>
+      </w:r>
+      <w:r>
+        <w:rPr>
+          <w:rFonts w:ascii="Aptos" w:hAnsi="Aptos"/>
+        </w:rPr>
+        <w:t>stores student data in a file</w:t>
       </w:r>
     </w:p>
     <w:p>
       <w:pPr>
-        <w:rPr>
-          <w:rFonts w:ascii="Aptos" w:hAnsi="Aptos"/>
-          <w:color w:val="000000" w:themeColor="text1"/>
+        <w:pStyle w:val="NormalWeb"/>
+        <w:numPr>
+          <w:ilvl w:val="0"/>
+          <w:numId w:val="17"/>
+        </w:numPr>
+        <w:spacing w:line="360" w:lineRule="auto"/>
+        <w:rPr>
+          <w:rFonts w:ascii="Aptos" w:hAnsi="Aptos"/>
+        </w:rPr>
+      </w:pPr>
+      <w:proofErr w:type="spellStart"/>
+      <w:r>
+        <w:rPr>
+          <w:rStyle w:val="HTMLCode"/>
+          <w:rFonts w:ascii="Aptos" w:hAnsi="Aptos"/>
           <w:sz w:val="24"/>
           <w:szCs w:val="24"/>
         </w:rPr>
-      </w:pPr>
+        <w:t>displayRecords</w:t>
+      </w:r>
+      <w:proofErr w:type="spellEnd"/>
       <w:r>
         <w:rPr>
-          <w:rFonts w:ascii="Aptos" w:hAnsi="Aptos"/>
-          <w:color w:val="000000" w:themeColor="text1"/>
+          <w:rStyle w:val="HTMLCode"/>
+          <w:rFonts w:ascii="Aptos" w:hAnsi="Aptos"/>
           <w:sz w:val="24"/>
           <w:szCs w:val="24"/>
         </w:rPr>
-        <w:t>• saveToFile() – Store student details in a file</w:t>
+        <w:t>()</w:t>
+      </w:r>
+      <w:r>
+        <w:rPr>
+          <w:rFonts w:ascii="Aptos" w:hAnsi="Aptos"/>
+        </w:rPr>
+        <w:t xml:space="preserve"> – displays all stored student records</w:t>
+      </w:r>
+    </w:p>
+    <w:p>
+      <w:pPr>
+        <w:pStyle w:val="NormalWeb"/>
+        <w:numPr>
+          <w:ilvl w:val="0"/>
+          <w:numId w:val="17"/>
+        </w:numPr>
+        <w:spacing w:line="360" w:lineRule="auto"/>
+        <w:rPr>
+          <w:rFonts w:ascii="Aptos" w:hAnsi="Aptos"/>
+        </w:rPr>
+      </w:pPr>
+      <w:proofErr w:type="spellStart"/>
+      <w:r>
+        <w:rPr>
+          <w:rStyle w:val="HTMLCode"/>
+          <w:rFonts w:ascii="Aptos" w:hAnsi="Aptos"/>
+          <w:sz w:val="24"/>
+          <w:szCs w:val="24"/>
+        </w:rPr>
+        <w:t>searchStudent</w:t>
+      </w:r>
+      <w:proofErr w:type="spellEnd"/>
+      <w:r>
+        <w:rPr>
+          <w:rStyle w:val="HTMLCode"/>
+          <w:rFonts w:ascii="Aptos" w:hAnsi="Aptos"/>
+          <w:sz w:val="24"/>
+          <w:szCs w:val="24"/>
+        </w:rPr>
+        <w:t>()</w:t>
+      </w:r>
+      <w:r>
+        <w:rPr>
+          <w:rFonts w:ascii="Aptos" w:hAnsi="Aptos"/>
+        </w:rPr>
+        <w:t xml:space="preserve"> – searches a student by name</w:t>
       </w:r>
     </w:p>
     <w:p>
@@ -1740,9 +1854,9 @@
         </w:rPr>
         <w:drawing>
           <wp:inline distT="0" distB="0" distL="0" distR="0">
-            <wp:extent cx="4248319" cy="2469827"/>
-            <wp:effectExtent l="0" t="0" r="0" b="0"/>
-            <wp:docPr id="414660564" name="Picture 1"/>
+            <wp:extent cx="5486400" cy="1853565"/>
+            <wp:effectExtent l="0" t="0" r="0" b="635"/>
+            <wp:docPr id="1734655514" name="Picture 1" descr="A screenshot of a computer&#10;&#10;AI-generated content may be incorrect."/>
             <wp:cNvGraphicFramePr>
               <a:graphicFrameLocks xmlns:a="http://schemas.openxmlformats.org/drawingml/2006/main" noChangeAspect="1"/>
             </wp:cNvGraphicFramePr>
@@ -1750,7 +1864,7 @@
               <a:graphicData uri="http://schemas.openxmlformats.org/drawingml/2006/picture">
                 <pic:pic xmlns:pic="http://schemas.openxmlformats.org/drawingml/2006/picture">
                   <pic:nvPicPr>
-                    <pic:cNvPr id="414660564" name="Picture 414660564"/>
+                    <pic:cNvPr id="1734655514" name="Picture 1" descr="A screenshot of a computer&#10;&#10;AI-generated content may be incorrect."/>
                     <pic:cNvPicPr/>
                   </pic:nvPicPr>
                   <pic:blipFill>
@@ -1762,7 +1876,7 @@
                   <pic:spPr>
                     <a:xfrm>
                       <a:off x="0" y="0"/>
-                      <a:ext cx="4297549" cy="2498448"/>
+                      <a:ext cx="5486400" cy="1853565"/>
                     </a:xfrm>
                     <a:prstGeom prst="rect">
                       <a:avLst/>
@@ -1797,100 +1911,101 @@
     </w:p>
     <w:p>
       <w:pPr>
-        <w:rPr>
-          <w:rFonts w:ascii="Aptos" w:hAnsi="Aptos"/>
-          <w:color w:val="000000" w:themeColor="text1"/>
-          <w:sz w:val="24"/>
-          <w:szCs w:val="24"/>
+        <w:pStyle w:val="NormalWeb"/>
+        <w:numPr>
+          <w:ilvl w:val="0"/>
+          <w:numId w:val="18"/>
+        </w:numPr>
+        <w:spacing w:line="360" w:lineRule="auto"/>
+        <w:rPr>
+          <w:rFonts w:ascii="Aptos" w:hAnsi="Aptos"/>
         </w:rPr>
       </w:pPr>
       <w:r>
         <w:rPr>
           <w:rFonts w:ascii="Aptos" w:hAnsi="Aptos"/>
-          <w:color w:val="000000" w:themeColor="text1"/>
-        </w:rPr>
-        <w:t xml:space="preserve">• </w:t>
-      </w:r>
-      <w:r>
-        <w:rPr>
-          <w:rFonts w:ascii="Aptos" w:hAnsi="Aptos"/>
-          <w:color w:val="000000" w:themeColor="text1"/>
-          <w:sz w:val="24"/>
-          <w:szCs w:val="24"/>
-        </w:rPr>
-        <w:t>Simple and easy to use</w:t>
+        </w:rPr>
+        <w:t>Allows searching for student records</w:t>
       </w:r>
     </w:p>
     <w:p>
       <w:pPr>
-        <w:rPr>
-          <w:rFonts w:ascii="Aptos" w:hAnsi="Aptos"/>
-          <w:color w:val="000000" w:themeColor="text1"/>
-          <w:sz w:val="24"/>
-          <w:szCs w:val="24"/>
+        <w:pStyle w:val="NormalWeb"/>
+        <w:numPr>
+          <w:ilvl w:val="0"/>
+          <w:numId w:val="18"/>
+        </w:numPr>
+        <w:spacing w:line="360" w:lineRule="auto"/>
+        <w:rPr>
+          <w:rFonts w:ascii="Aptos" w:hAnsi="Aptos"/>
         </w:rPr>
       </w:pPr>
       <w:r>
         <w:rPr>
           <w:rFonts w:ascii="Aptos" w:hAnsi="Aptos"/>
-          <w:color w:val="000000" w:themeColor="text1"/>
-          <w:sz w:val="24"/>
-          <w:szCs w:val="24"/>
-        </w:rPr>
-        <w:t>• Demonstrates key C++ programming concepts</w:t>
+        </w:rPr>
+        <w:t>Allows displaying all stored student data</w:t>
       </w:r>
     </w:p>
     <w:p>
       <w:pPr>
-        <w:rPr>
-          <w:rFonts w:ascii="Aptos" w:hAnsi="Aptos"/>
-          <w:color w:val="000000" w:themeColor="text1"/>
-          <w:sz w:val="24"/>
-          <w:szCs w:val="24"/>
+        <w:pStyle w:val="NormalWeb"/>
+        <w:numPr>
+          <w:ilvl w:val="0"/>
+          <w:numId w:val="18"/>
+        </w:numPr>
+        <w:spacing w:line="360" w:lineRule="auto"/>
+        <w:rPr>
+          <w:rFonts w:ascii="Aptos" w:hAnsi="Aptos"/>
         </w:rPr>
       </w:pPr>
       <w:r>
         <w:rPr>
           <w:rFonts w:ascii="Aptos" w:hAnsi="Aptos"/>
-          <w:color w:val="000000" w:themeColor="text1"/>
-          <w:sz w:val="24"/>
-          <w:szCs w:val="24"/>
-        </w:rPr>
-        <w:t>• Maintains student records using file storage</w:t>
+        </w:rPr>
+        <w:t>Automatically calculates scholarship eligibility</w:t>
       </w:r>
     </w:p>
     <w:p>
       <w:pPr>
         <w:rPr>
           <w:rFonts w:ascii="Aptos" w:hAnsi="Aptos"/>
-          <w:color w:val="000000" w:themeColor="text1"/>
-          <w:sz w:val="24"/>
-          <w:szCs w:val="24"/>
-        </w:rPr>
-      </w:pPr>
-      <w:r>
-        <w:rPr>
-          <w:rFonts w:ascii="Aptos" w:hAnsi="Aptos"/>
-          <w:color w:val="000000" w:themeColor="text1"/>
-          <w:sz w:val="24"/>
-          <w:szCs w:val="24"/>
-        </w:rPr>
-        <w:t>• Can be extended into a full management system</w:t>
-      </w:r>
-    </w:p>
-    <w:p>
-      <w:pPr>
-        <w:pStyle w:val="Heading1"/>
-        <w:rPr>
-          <w:rFonts w:ascii="Aptos" w:hAnsi="Aptos"/>
+          <w:b/>
+          <w:bCs/>
           <w:color w:val="000000" w:themeColor="text1"/>
           <w:sz w:val="32"/>
           <w:szCs w:val="32"/>
         </w:rPr>
       </w:pPr>
+    </w:p>
+    <w:p>
+      <w:pPr>
+        <w:rPr>
+          <w:rFonts w:ascii="Aptos" w:hAnsi="Aptos"/>
+          <w:b/>
+          <w:bCs/>
+          <w:color w:val="000000" w:themeColor="text1"/>
+          <w:sz w:val="32"/>
+          <w:szCs w:val="32"/>
+        </w:rPr>
+      </w:pPr>
+    </w:p>
+    <w:p>
+      <w:pPr>
+        <w:rPr>
+          <w:rFonts w:ascii="Aptos" w:hAnsi="Aptos"/>
+          <w:b/>
+          <w:bCs/>
+          <w:color w:val="000000" w:themeColor="text1"/>
+          <w:sz w:val="32"/>
+          <w:szCs w:val="32"/>
+        </w:rPr>
+      </w:pPr>
       <w:r>
         <w:rPr>
           <w:rFonts w:ascii="Aptos" w:hAnsi="Aptos"/>
+          <w:b/>
+          <w:bCs/>
           <w:color w:val="000000" w:themeColor="text1"/>
           <w:sz w:val="32"/>
           <w:szCs w:val="32"/>
@@ -2088,6 +2203,7 @@
     </w:p>
     <w:p>
       <w:pPr>
+        <w:spacing w:line="360" w:lineRule="auto"/>
         <w:rPr>
           <w:rFonts w:ascii="Aptos" w:hAnsi="Aptos"/>
           <w:color w:val="000000" w:themeColor="text1"/>
@@ -2107,6 +2223,7 @@
     </w:p>
     <w:p>
       <w:pPr>
+        <w:spacing w:line="360" w:lineRule="auto"/>
         <w:rPr>
           <w:rFonts w:ascii="Aptos" w:hAnsi="Aptos"/>
           <w:color w:val="000000" w:themeColor="text1"/>
@@ -2313,6 +2430,1130 @@
       </w:rPr>
     </w:lvl>
   </w:abstractNum>
+  <w:abstractNum w:abstractNumId="9" w15:restartNumberingAfterBreak="0">
+    <w:nsid w:val="08B6547D"/>
+    <w:multiLevelType w:val="hybridMultilevel"/>
+    <w:tmpl w:val="7A4655CE"/>
+    <w:lvl w:ilvl="0" w:tplc="08090001">
+      <w:start w:val="1"/>
+      <w:numFmt w:val="bullet"/>
+      <w:lvlText w:val=""/>
+      <w:lvlJc w:val="left"/>
+      <w:pPr>
+        <w:ind w:left="720" w:hanging="360"/>
+      </w:pPr>
+      <w:rPr>
+        <w:rFonts w:ascii="Symbol" w:hAnsi="Symbol" w:hint="default"/>
+      </w:rPr>
+    </w:lvl>
+    <w:lvl w:ilvl="1" w:tplc="FFFFFFFF" w:tentative="1">
+      <w:start w:val="1"/>
+      <w:numFmt w:val="bullet"/>
+      <w:lvlText w:val="o"/>
+      <w:lvlJc w:val="left"/>
+      <w:pPr>
+        <w:ind w:left="1440" w:hanging="360"/>
+      </w:pPr>
+      <w:rPr>
+        <w:rFonts w:ascii="Courier New" w:hAnsi="Courier New" w:hint="default"/>
+      </w:rPr>
+    </w:lvl>
+    <w:lvl w:ilvl="2" w:tplc="FFFFFFFF" w:tentative="1">
+      <w:start w:val="1"/>
+      <w:numFmt w:val="bullet"/>
+      <w:lvlText w:val=""/>
+      <w:lvlJc w:val="left"/>
+      <w:pPr>
+        <w:ind w:left="2160" w:hanging="360"/>
+      </w:pPr>
+      <w:rPr>
+        <w:rFonts w:ascii="Wingdings" w:hAnsi="Wingdings" w:hint="default"/>
+      </w:rPr>
+    </w:lvl>
+    <w:lvl w:ilvl="3" w:tplc="FFFFFFFF" w:tentative="1">
+      <w:start w:val="1"/>
+      <w:numFmt w:val="bullet"/>
+      <w:lvlText w:val=""/>
+      <w:lvlJc w:val="left"/>
+      <w:pPr>
+        <w:ind w:left="2880" w:hanging="360"/>
+      </w:pPr>
+      <w:rPr>
+        <w:rFonts w:ascii="Symbol" w:hAnsi="Symbol" w:hint="default"/>
+      </w:rPr>
+    </w:lvl>
+    <w:lvl w:ilvl="4" w:tplc="FFFFFFFF" w:tentative="1">
+      <w:start w:val="1"/>
+      <w:numFmt w:val="bullet"/>
+      <w:lvlText w:val="o"/>
+      <w:lvlJc w:val="left"/>
+      <w:pPr>
+        <w:ind w:left="3600" w:hanging="360"/>
+      </w:pPr>
+      <w:rPr>
+        <w:rFonts w:ascii="Courier New" w:hAnsi="Courier New" w:hint="default"/>
+      </w:rPr>
+    </w:lvl>
+    <w:lvl w:ilvl="5" w:tplc="FFFFFFFF" w:tentative="1">
+      <w:start w:val="1"/>
+      <w:numFmt w:val="bullet"/>
+      <w:lvlText w:val=""/>
+      <w:lvlJc w:val="left"/>
+      <w:pPr>
+        <w:ind w:left="4320" w:hanging="360"/>
+      </w:pPr>
+      <w:rPr>
+        <w:rFonts w:ascii="Wingdings" w:hAnsi="Wingdings" w:hint="default"/>
+      </w:rPr>
+    </w:lvl>
+    <w:lvl w:ilvl="6" w:tplc="FFFFFFFF" w:tentative="1">
+      <w:start w:val="1"/>
+      <w:numFmt w:val="bullet"/>
+      <w:lvlText w:val=""/>
+      <w:lvlJc w:val="left"/>
+      <w:pPr>
+        <w:ind w:left="5040" w:hanging="360"/>
+      </w:pPr>
+      <w:rPr>
+        <w:rFonts w:ascii="Symbol" w:hAnsi="Symbol" w:hint="default"/>
+      </w:rPr>
+    </w:lvl>
+    <w:lvl w:ilvl="7" w:tplc="FFFFFFFF" w:tentative="1">
+      <w:start w:val="1"/>
+      <w:numFmt w:val="bullet"/>
+      <w:lvlText w:val="o"/>
+      <w:lvlJc w:val="left"/>
+      <w:pPr>
+        <w:ind w:left="5760" w:hanging="360"/>
+      </w:pPr>
+      <w:rPr>
+        <w:rFonts w:ascii="Courier New" w:hAnsi="Courier New" w:hint="default"/>
+      </w:rPr>
+    </w:lvl>
+    <w:lvl w:ilvl="8" w:tplc="FFFFFFFF" w:tentative="1">
+      <w:start w:val="1"/>
+      <w:numFmt w:val="bullet"/>
+      <w:lvlText w:val=""/>
+      <w:lvlJc w:val="left"/>
+      <w:pPr>
+        <w:ind w:left="6480" w:hanging="360"/>
+      </w:pPr>
+      <w:rPr>
+        <w:rFonts w:ascii="Wingdings" w:hAnsi="Wingdings" w:hint="default"/>
+      </w:rPr>
+    </w:lvl>
+  </w:abstractNum>
+  <w:abstractNum w:abstractNumId="10" w15:restartNumberingAfterBreak="0">
+    <w:nsid w:val="1A641D92"/>
+    <w:multiLevelType w:val="multilevel"/>
+    <w:tmpl w:val="491C1F52"/>
+    <w:lvl w:ilvl="0">
+      <w:start w:val="1"/>
+      <w:numFmt w:val="bullet"/>
+      <w:lvlText w:val=""/>
+      <w:lvlJc w:val="left"/>
+      <w:pPr>
+        <w:tabs>
+          <w:tab w:val="num" w:pos="720"/>
+        </w:tabs>
+        <w:ind w:left="720" w:hanging="360"/>
+      </w:pPr>
+      <w:rPr>
+        <w:rFonts w:ascii="Symbol" w:hAnsi="Symbol" w:hint="default"/>
+        <w:sz w:val="20"/>
+      </w:rPr>
+    </w:lvl>
+    <w:lvl w:ilvl="1" w:tentative="1">
+      <w:start w:val="1"/>
+      <w:numFmt w:val="bullet"/>
+      <w:lvlText w:val="o"/>
+      <w:lvlJc w:val="left"/>
+      <w:pPr>
+        <w:tabs>
+          <w:tab w:val="num" w:pos="1440"/>
+        </w:tabs>
+        <w:ind w:left="1440" w:hanging="360"/>
+      </w:pPr>
+      <w:rPr>
+        <w:rFonts w:ascii="Courier New" w:hAnsi="Courier New" w:hint="default"/>
+        <w:sz w:val="20"/>
+      </w:rPr>
+    </w:lvl>
+    <w:lvl w:ilvl="2" w:tentative="1">
+      <w:start w:val="1"/>
+      <w:numFmt w:val="bullet"/>
+      <w:lvlText w:val=""/>
+      <w:lvlJc w:val="left"/>
+      <w:pPr>
+        <w:tabs>
+          <w:tab w:val="num" w:pos="2160"/>
+        </w:tabs>
+        <w:ind w:left="2160" w:hanging="360"/>
+      </w:pPr>
+      <w:rPr>
+        <w:rFonts w:ascii="Wingdings" w:hAnsi="Wingdings" w:hint="default"/>
+        <w:sz w:val="20"/>
+      </w:rPr>
+    </w:lvl>
+    <w:lvl w:ilvl="3" w:tentative="1">
+      <w:start w:val="1"/>
+      <w:numFmt w:val="bullet"/>
+      <w:lvlText w:val=""/>
+      <w:lvlJc w:val="left"/>
+      <w:pPr>
+        <w:tabs>
+          <w:tab w:val="num" w:pos="2880"/>
+        </w:tabs>
+        <w:ind w:left="2880" w:hanging="360"/>
+      </w:pPr>
+      <w:rPr>
+        <w:rFonts w:ascii="Wingdings" w:hAnsi="Wingdings" w:hint="default"/>
+        <w:sz w:val="20"/>
+      </w:rPr>
+    </w:lvl>
+    <w:lvl w:ilvl="4" w:tentative="1">
+      <w:start w:val="1"/>
+      <w:numFmt w:val="bullet"/>
+      <w:lvlText w:val=""/>
+      <w:lvlJc w:val="left"/>
+      <w:pPr>
+        <w:tabs>
+          <w:tab w:val="num" w:pos="3600"/>
+        </w:tabs>
+        <w:ind w:left="3600" w:hanging="360"/>
+      </w:pPr>
+      <w:rPr>
+        <w:rFonts w:ascii="Wingdings" w:hAnsi="Wingdings" w:hint="default"/>
+        <w:sz w:val="20"/>
+      </w:rPr>
+    </w:lvl>
+    <w:lvl w:ilvl="5" w:tentative="1">
+      <w:start w:val="1"/>
+      <w:numFmt w:val="bullet"/>
+      <w:lvlText w:val=""/>
+      <w:lvlJc w:val="left"/>
+      <w:pPr>
+        <w:tabs>
+          <w:tab w:val="num" w:pos="4320"/>
+        </w:tabs>
+        <w:ind w:left="4320" w:hanging="360"/>
+      </w:pPr>
+      <w:rPr>
+        <w:rFonts w:ascii="Wingdings" w:hAnsi="Wingdings" w:hint="default"/>
+        <w:sz w:val="20"/>
+      </w:rPr>
+    </w:lvl>
+    <w:lvl w:ilvl="6" w:tentative="1">
+      <w:start w:val="1"/>
+      <w:numFmt w:val="bullet"/>
+      <w:lvlText w:val=""/>
+      <w:lvlJc w:val="left"/>
+      <w:pPr>
+        <w:tabs>
+          <w:tab w:val="num" w:pos="5040"/>
+        </w:tabs>
+        <w:ind w:left="5040" w:hanging="360"/>
+      </w:pPr>
+      <w:rPr>
+        <w:rFonts w:ascii="Wingdings" w:hAnsi="Wingdings" w:hint="default"/>
+        <w:sz w:val="20"/>
+      </w:rPr>
+    </w:lvl>
+    <w:lvl w:ilvl="7" w:tentative="1">
+      <w:start w:val="1"/>
+      <w:numFmt w:val="bullet"/>
+      <w:lvlText w:val=""/>
+      <w:lvlJc w:val="left"/>
+      <w:pPr>
+        <w:tabs>
+          <w:tab w:val="num" w:pos="5760"/>
+        </w:tabs>
+        <w:ind w:left="5760" w:hanging="360"/>
+      </w:pPr>
+      <w:rPr>
+        <w:rFonts w:ascii="Wingdings" w:hAnsi="Wingdings" w:hint="default"/>
+        <w:sz w:val="20"/>
+      </w:rPr>
+    </w:lvl>
+    <w:lvl w:ilvl="8" w:tentative="1">
+      <w:start w:val="1"/>
+      <w:numFmt w:val="bullet"/>
+      <w:lvlText w:val=""/>
+      <w:lvlJc w:val="left"/>
+      <w:pPr>
+        <w:tabs>
+          <w:tab w:val="num" w:pos="6480"/>
+        </w:tabs>
+        <w:ind w:left="6480" w:hanging="360"/>
+      </w:pPr>
+      <w:rPr>
+        <w:rFonts w:ascii="Wingdings" w:hAnsi="Wingdings" w:hint="default"/>
+        <w:sz w:val="20"/>
+      </w:rPr>
+    </w:lvl>
+  </w:abstractNum>
+  <w:abstractNum w:abstractNumId="11" w15:restartNumberingAfterBreak="0">
+    <w:nsid w:val="281E5335"/>
+    <w:multiLevelType w:val="multilevel"/>
+    <w:tmpl w:val="DA2C49E8"/>
+    <w:lvl w:ilvl="0">
+      <w:start w:val="1"/>
+      <w:numFmt w:val="bullet"/>
+      <w:lvlText w:val=""/>
+      <w:lvlJc w:val="left"/>
+      <w:pPr>
+        <w:tabs>
+          <w:tab w:val="num" w:pos="720"/>
+        </w:tabs>
+        <w:ind w:left="720" w:hanging="360"/>
+      </w:pPr>
+      <w:rPr>
+        <w:rFonts w:ascii="Symbol" w:hAnsi="Symbol" w:hint="default"/>
+        <w:sz w:val="20"/>
+      </w:rPr>
+    </w:lvl>
+    <w:lvl w:ilvl="1" w:tentative="1">
+      <w:start w:val="1"/>
+      <w:numFmt w:val="bullet"/>
+      <w:lvlText w:val="o"/>
+      <w:lvlJc w:val="left"/>
+      <w:pPr>
+        <w:tabs>
+          <w:tab w:val="num" w:pos="1440"/>
+        </w:tabs>
+        <w:ind w:left="1440" w:hanging="360"/>
+      </w:pPr>
+      <w:rPr>
+        <w:rFonts w:ascii="Courier New" w:hAnsi="Courier New" w:hint="default"/>
+        <w:sz w:val="20"/>
+      </w:rPr>
+    </w:lvl>
+    <w:lvl w:ilvl="2" w:tentative="1">
+      <w:start w:val="1"/>
+      <w:numFmt w:val="bullet"/>
+      <w:lvlText w:val=""/>
+      <w:lvlJc w:val="left"/>
+      <w:pPr>
+        <w:tabs>
+          <w:tab w:val="num" w:pos="2160"/>
+        </w:tabs>
+        <w:ind w:left="2160" w:hanging="360"/>
+      </w:pPr>
+      <w:rPr>
+        <w:rFonts w:ascii="Wingdings" w:hAnsi="Wingdings" w:hint="default"/>
+        <w:sz w:val="20"/>
+      </w:rPr>
+    </w:lvl>
+    <w:lvl w:ilvl="3" w:tentative="1">
+      <w:start w:val="1"/>
+      <w:numFmt w:val="bullet"/>
+      <w:lvlText w:val=""/>
+      <w:lvlJc w:val="left"/>
+      <w:pPr>
+        <w:tabs>
+          <w:tab w:val="num" w:pos="2880"/>
+        </w:tabs>
+        <w:ind w:left="2880" w:hanging="360"/>
+      </w:pPr>
+      <w:rPr>
+        <w:rFonts w:ascii="Wingdings" w:hAnsi="Wingdings" w:hint="default"/>
+        <w:sz w:val="20"/>
+      </w:rPr>
+    </w:lvl>
+    <w:lvl w:ilvl="4" w:tentative="1">
+      <w:start w:val="1"/>
+      <w:numFmt w:val="bullet"/>
+      <w:lvlText w:val=""/>
+      <w:lvlJc w:val="left"/>
+      <w:pPr>
+        <w:tabs>
+          <w:tab w:val="num" w:pos="3600"/>
+        </w:tabs>
+        <w:ind w:left="3600" w:hanging="360"/>
+      </w:pPr>
+      <w:rPr>
+        <w:rFonts w:ascii="Wingdings" w:hAnsi="Wingdings" w:hint="default"/>
+        <w:sz w:val="20"/>
+      </w:rPr>
+    </w:lvl>
+    <w:lvl w:ilvl="5" w:tentative="1">
+      <w:start w:val="1"/>
+      <w:numFmt w:val="bullet"/>
+      <w:lvlText w:val=""/>
+      <w:lvlJc w:val="left"/>
+      <w:pPr>
+        <w:tabs>
+          <w:tab w:val="num" w:pos="4320"/>
+        </w:tabs>
+        <w:ind w:left="4320" w:hanging="360"/>
+      </w:pPr>
+      <w:rPr>
+        <w:rFonts w:ascii="Wingdings" w:hAnsi="Wingdings" w:hint="default"/>
+        <w:sz w:val="20"/>
+      </w:rPr>
+    </w:lvl>
+    <w:lvl w:ilvl="6" w:tentative="1">
+      <w:start w:val="1"/>
+      <w:numFmt w:val="bullet"/>
+      <w:lvlText w:val=""/>
+      <w:lvlJc w:val="left"/>
+      <w:pPr>
+        <w:tabs>
+          <w:tab w:val="num" w:pos="5040"/>
+        </w:tabs>
+        <w:ind w:left="5040" w:hanging="360"/>
+      </w:pPr>
+      <w:rPr>
+        <w:rFonts w:ascii="Wingdings" w:hAnsi="Wingdings" w:hint="default"/>
+        <w:sz w:val="20"/>
+      </w:rPr>
+    </w:lvl>
+    <w:lvl w:ilvl="7" w:tentative="1">
+      <w:start w:val="1"/>
+      <w:numFmt w:val="bullet"/>
+      <w:lvlText w:val=""/>
+      <w:lvlJc w:val="left"/>
+      <w:pPr>
+        <w:tabs>
+          <w:tab w:val="num" w:pos="5760"/>
+        </w:tabs>
+        <w:ind w:left="5760" w:hanging="360"/>
+      </w:pPr>
+      <w:rPr>
+        <w:rFonts w:ascii="Wingdings" w:hAnsi="Wingdings" w:hint="default"/>
+        <w:sz w:val="20"/>
+      </w:rPr>
+    </w:lvl>
+    <w:lvl w:ilvl="8" w:tentative="1">
+      <w:start w:val="1"/>
+      <w:numFmt w:val="bullet"/>
+      <w:lvlText w:val=""/>
+      <w:lvlJc w:val="left"/>
+      <w:pPr>
+        <w:tabs>
+          <w:tab w:val="num" w:pos="6480"/>
+        </w:tabs>
+        <w:ind w:left="6480" w:hanging="360"/>
+      </w:pPr>
+      <w:rPr>
+        <w:rFonts w:ascii="Wingdings" w:hAnsi="Wingdings" w:hint="default"/>
+        <w:sz w:val="20"/>
+      </w:rPr>
+    </w:lvl>
+  </w:abstractNum>
+  <w:abstractNum w:abstractNumId="12" w15:restartNumberingAfterBreak="0">
+    <w:nsid w:val="31566BEE"/>
+    <w:multiLevelType w:val="hybridMultilevel"/>
+    <w:tmpl w:val="CDFA8086"/>
+    <w:lvl w:ilvl="0" w:tplc="08090001">
+      <w:start w:val="1"/>
+      <w:numFmt w:val="bullet"/>
+      <w:lvlText w:val=""/>
+      <w:lvlJc w:val="left"/>
+      <w:pPr>
+        <w:ind w:left="720" w:hanging="360"/>
+      </w:pPr>
+      <w:rPr>
+        <w:rFonts w:ascii="Symbol" w:hAnsi="Symbol" w:hint="default"/>
+      </w:rPr>
+    </w:lvl>
+    <w:lvl w:ilvl="1" w:tplc="08090003" w:tentative="1">
+      <w:start w:val="1"/>
+      <w:numFmt w:val="bullet"/>
+      <w:lvlText w:val="o"/>
+      <w:lvlJc w:val="left"/>
+      <w:pPr>
+        <w:ind w:left="1440" w:hanging="360"/>
+      </w:pPr>
+      <w:rPr>
+        <w:rFonts w:ascii="Courier New" w:hAnsi="Courier New" w:hint="default"/>
+      </w:rPr>
+    </w:lvl>
+    <w:lvl w:ilvl="2" w:tplc="08090005" w:tentative="1">
+      <w:start w:val="1"/>
+      <w:numFmt w:val="bullet"/>
+      <w:lvlText w:val=""/>
+      <w:lvlJc w:val="left"/>
+      <w:pPr>
+        <w:ind w:left="2160" w:hanging="360"/>
+      </w:pPr>
+      <w:rPr>
+        <w:rFonts w:ascii="Wingdings" w:hAnsi="Wingdings" w:hint="default"/>
+      </w:rPr>
+    </w:lvl>
+    <w:lvl w:ilvl="3" w:tplc="08090001" w:tentative="1">
+      <w:start w:val="1"/>
+      <w:numFmt w:val="bullet"/>
+      <w:lvlText w:val=""/>
+      <w:lvlJc w:val="left"/>
+      <w:pPr>
+        <w:ind w:left="2880" w:hanging="360"/>
+      </w:pPr>
+      <w:rPr>
+        <w:rFonts w:ascii="Symbol" w:hAnsi="Symbol" w:hint="default"/>
+      </w:rPr>
+    </w:lvl>
+    <w:lvl w:ilvl="4" w:tplc="08090003" w:tentative="1">
+      <w:start w:val="1"/>
+      <w:numFmt w:val="bullet"/>
+      <w:lvlText w:val="o"/>
+      <w:lvlJc w:val="left"/>
+      <w:pPr>
+        <w:ind w:left="3600" w:hanging="360"/>
+      </w:pPr>
+      <w:rPr>
+        <w:rFonts w:ascii="Courier New" w:hAnsi="Courier New" w:hint="default"/>
+      </w:rPr>
+    </w:lvl>
+    <w:lvl w:ilvl="5" w:tplc="08090005" w:tentative="1">
+      <w:start w:val="1"/>
+      <w:numFmt w:val="bullet"/>
+      <w:lvlText w:val=""/>
+      <w:lvlJc w:val="left"/>
+      <w:pPr>
+        <w:ind w:left="4320" w:hanging="360"/>
+      </w:pPr>
+      <w:rPr>
+        <w:rFonts w:ascii="Wingdings" w:hAnsi="Wingdings" w:hint="default"/>
+      </w:rPr>
+    </w:lvl>
+    <w:lvl w:ilvl="6" w:tplc="08090001" w:tentative="1">
+      <w:start w:val="1"/>
+      <w:numFmt w:val="bullet"/>
+      <w:lvlText w:val=""/>
+      <w:lvlJc w:val="left"/>
+      <w:pPr>
+        <w:ind w:left="5040" w:hanging="360"/>
+      </w:pPr>
+      <w:rPr>
+        <w:rFonts w:ascii="Symbol" w:hAnsi="Symbol" w:hint="default"/>
+      </w:rPr>
+    </w:lvl>
+    <w:lvl w:ilvl="7" w:tplc="08090003" w:tentative="1">
+      <w:start w:val="1"/>
+      <w:numFmt w:val="bullet"/>
+      <w:lvlText w:val="o"/>
+      <w:lvlJc w:val="left"/>
+      <w:pPr>
+        <w:ind w:left="5760" w:hanging="360"/>
+      </w:pPr>
+      <w:rPr>
+        <w:rFonts w:ascii="Courier New" w:hAnsi="Courier New" w:hint="default"/>
+      </w:rPr>
+    </w:lvl>
+    <w:lvl w:ilvl="8" w:tplc="08090005" w:tentative="1">
+      <w:start w:val="1"/>
+      <w:numFmt w:val="bullet"/>
+      <w:lvlText w:val=""/>
+      <w:lvlJc w:val="left"/>
+      <w:pPr>
+        <w:ind w:left="6480" w:hanging="360"/>
+      </w:pPr>
+      <w:rPr>
+        <w:rFonts w:ascii="Wingdings" w:hAnsi="Wingdings" w:hint="default"/>
+      </w:rPr>
+    </w:lvl>
+  </w:abstractNum>
+  <w:abstractNum w:abstractNumId="13" w15:restartNumberingAfterBreak="0">
+    <w:nsid w:val="42BF563D"/>
+    <w:multiLevelType w:val="hybridMultilevel"/>
+    <w:tmpl w:val="435474F4"/>
+    <w:lvl w:ilvl="0" w:tplc="08090001">
+      <w:start w:val="1"/>
+      <w:numFmt w:val="bullet"/>
+      <w:lvlText w:val=""/>
+      <w:lvlJc w:val="left"/>
+      <w:pPr>
+        <w:ind w:left="720" w:hanging="360"/>
+      </w:pPr>
+      <w:rPr>
+        <w:rFonts w:ascii="Symbol" w:hAnsi="Symbol" w:hint="default"/>
+      </w:rPr>
+    </w:lvl>
+    <w:lvl w:ilvl="1" w:tplc="08090003" w:tentative="1">
+      <w:start w:val="1"/>
+      <w:numFmt w:val="bullet"/>
+      <w:lvlText w:val="o"/>
+      <w:lvlJc w:val="left"/>
+      <w:pPr>
+        <w:ind w:left="1440" w:hanging="360"/>
+      </w:pPr>
+      <w:rPr>
+        <w:rFonts w:ascii="Courier New" w:hAnsi="Courier New" w:hint="default"/>
+      </w:rPr>
+    </w:lvl>
+    <w:lvl w:ilvl="2" w:tplc="08090005" w:tentative="1">
+      <w:start w:val="1"/>
+      <w:numFmt w:val="bullet"/>
+      <w:lvlText w:val=""/>
+      <w:lvlJc w:val="left"/>
+      <w:pPr>
+        <w:ind w:left="2160" w:hanging="360"/>
+      </w:pPr>
+      <w:rPr>
+        <w:rFonts w:ascii="Wingdings" w:hAnsi="Wingdings" w:hint="default"/>
+      </w:rPr>
+    </w:lvl>
+    <w:lvl w:ilvl="3" w:tplc="08090001" w:tentative="1">
+      <w:start w:val="1"/>
+      <w:numFmt w:val="bullet"/>
+      <w:lvlText w:val=""/>
+      <w:lvlJc w:val="left"/>
+      <w:pPr>
+        <w:ind w:left="2880" w:hanging="360"/>
+      </w:pPr>
+      <w:rPr>
+        <w:rFonts w:ascii="Symbol" w:hAnsi="Symbol" w:hint="default"/>
+      </w:rPr>
+    </w:lvl>
+    <w:lvl w:ilvl="4" w:tplc="08090003" w:tentative="1">
+      <w:start w:val="1"/>
+      <w:numFmt w:val="bullet"/>
+      <w:lvlText w:val="o"/>
+      <w:lvlJc w:val="left"/>
+      <w:pPr>
+        <w:ind w:left="3600" w:hanging="360"/>
+      </w:pPr>
+      <w:rPr>
+        <w:rFonts w:ascii="Courier New" w:hAnsi="Courier New" w:hint="default"/>
+      </w:rPr>
+    </w:lvl>
+    <w:lvl w:ilvl="5" w:tplc="08090005" w:tentative="1">
+      <w:start w:val="1"/>
+      <w:numFmt w:val="bullet"/>
+      <w:lvlText w:val=""/>
+      <w:lvlJc w:val="left"/>
+      <w:pPr>
+        <w:ind w:left="4320" w:hanging="360"/>
+      </w:pPr>
+      <w:rPr>
+        <w:rFonts w:ascii="Wingdings" w:hAnsi="Wingdings" w:hint="default"/>
+      </w:rPr>
+    </w:lvl>
+    <w:lvl w:ilvl="6" w:tplc="08090001" w:tentative="1">
+      <w:start w:val="1"/>
+      <w:numFmt w:val="bullet"/>
+      <w:lvlText w:val=""/>
+      <w:lvlJc w:val="left"/>
+      <w:pPr>
+        <w:ind w:left="5040" w:hanging="360"/>
+      </w:pPr>
+      <w:rPr>
+        <w:rFonts w:ascii="Symbol" w:hAnsi="Symbol" w:hint="default"/>
+      </w:rPr>
+    </w:lvl>
+    <w:lvl w:ilvl="7" w:tplc="08090003" w:tentative="1">
+      <w:start w:val="1"/>
+      <w:numFmt w:val="bullet"/>
+      <w:lvlText w:val="o"/>
+      <w:lvlJc w:val="left"/>
+      <w:pPr>
+        <w:ind w:left="5760" w:hanging="360"/>
+      </w:pPr>
+      <w:rPr>
+        <w:rFonts w:ascii="Courier New" w:hAnsi="Courier New" w:hint="default"/>
+      </w:rPr>
+    </w:lvl>
+    <w:lvl w:ilvl="8" w:tplc="08090005" w:tentative="1">
+      <w:start w:val="1"/>
+      <w:numFmt w:val="bullet"/>
+      <w:lvlText w:val=""/>
+      <w:lvlJc w:val="left"/>
+      <w:pPr>
+        <w:ind w:left="6480" w:hanging="360"/>
+      </w:pPr>
+      <w:rPr>
+        <w:rFonts w:ascii="Wingdings" w:hAnsi="Wingdings" w:hint="default"/>
+      </w:rPr>
+    </w:lvl>
+  </w:abstractNum>
+  <w:abstractNum w:abstractNumId="14" w15:restartNumberingAfterBreak="0">
+    <w:nsid w:val="52D342CC"/>
+    <w:multiLevelType w:val="hybridMultilevel"/>
+    <w:tmpl w:val="7B169714"/>
+    <w:lvl w:ilvl="0" w:tplc="08090001">
+      <w:start w:val="1"/>
+      <w:numFmt w:val="bullet"/>
+      <w:lvlText w:val=""/>
+      <w:lvlJc w:val="left"/>
+      <w:pPr>
+        <w:ind w:left="720" w:hanging="360"/>
+      </w:pPr>
+      <w:rPr>
+        <w:rFonts w:ascii="Symbol" w:hAnsi="Symbol" w:hint="default"/>
+      </w:rPr>
+    </w:lvl>
+    <w:lvl w:ilvl="1" w:tplc="08090003" w:tentative="1">
+      <w:start w:val="1"/>
+      <w:numFmt w:val="bullet"/>
+      <w:lvlText w:val="o"/>
+      <w:lvlJc w:val="left"/>
+      <w:pPr>
+        <w:ind w:left="1440" w:hanging="360"/>
+      </w:pPr>
+      <w:rPr>
+        <w:rFonts w:ascii="Courier New" w:hAnsi="Courier New" w:hint="default"/>
+      </w:rPr>
+    </w:lvl>
+    <w:lvl w:ilvl="2" w:tplc="08090005" w:tentative="1">
+      <w:start w:val="1"/>
+      <w:numFmt w:val="bullet"/>
+      <w:lvlText w:val=""/>
+      <w:lvlJc w:val="left"/>
+      <w:pPr>
+        <w:ind w:left="2160" w:hanging="360"/>
+      </w:pPr>
+      <w:rPr>
+        <w:rFonts w:ascii="Wingdings" w:hAnsi="Wingdings" w:hint="default"/>
+      </w:rPr>
+    </w:lvl>
+    <w:lvl w:ilvl="3" w:tplc="08090001" w:tentative="1">
+      <w:start w:val="1"/>
+      <w:numFmt w:val="bullet"/>
+      <w:lvlText w:val=""/>
+      <w:lvlJc w:val="left"/>
+      <w:pPr>
+        <w:ind w:left="2880" w:hanging="360"/>
+      </w:pPr>
+      <w:rPr>
+        <w:rFonts w:ascii="Symbol" w:hAnsi="Symbol" w:hint="default"/>
+      </w:rPr>
+    </w:lvl>
+    <w:lvl w:ilvl="4" w:tplc="08090003" w:tentative="1">
+      <w:start w:val="1"/>
+      <w:numFmt w:val="bullet"/>
+      <w:lvlText w:val="o"/>
+      <w:lvlJc w:val="left"/>
+      <w:pPr>
+        <w:ind w:left="3600" w:hanging="360"/>
+      </w:pPr>
+      <w:rPr>
+        <w:rFonts w:ascii="Courier New" w:hAnsi="Courier New" w:hint="default"/>
+      </w:rPr>
+    </w:lvl>
+    <w:lvl w:ilvl="5" w:tplc="08090005" w:tentative="1">
+      <w:start w:val="1"/>
+      <w:numFmt w:val="bullet"/>
+      <w:lvlText w:val=""/>
+      <w:lvlJc w:val="left"/>
+      <w:pPr>
+        <w:ind w:left="4320" w:hanging="360"/>
+      </w:pPr>
+      <w:rPr>
+        <w:rFonts w:ascii="Wingdings" w:hAnsi="Wingdings" w:hint="default"/>
+      </w:rPr>
+    </w:lvl>
+    <w:lvl w:ilvl="6" w:tplc="08090001" w:tentative="1">
+      <w:start w:val="1"/>
+      <w:numFmt w:val="bullet"/>
+      <w:lvlText w:val=""/>
+      <w:lvlJc w:val="left"/>
+      <w:pPr>
+        <w:ind w:left="5040" w:hanging="360"/>
+      </w:pPr>
+      <w:rPr>
+        <w:rFonts w:ascii="Symbol" w:hAnsi="Symbol" w:hint="default"/>
+      </w:rPr>
+    </w:lvl>
+    <w:lvl w:ilvl="7" w:tplc="08090003" w:tentative="1">
+      <w:start w:val="1"/>
+      <w:numFmt w:val="bullet"/>
+      <w:lvlText w:val="o"/>
+      <w:lvlJc w:val="left"/>
+      <w:pPr>
+        <w:ind w:left="5760" w:hanging="360"/>
+      </w:pPr>
+      <w:rPr>
+        <w:rFonts w:ascii="Courier New" w:hAnsi="Courier New" w:hint="default"/>
+      </w:rPr>
+    </w:lvl>
+    <w:lvl w:ilvl="8" w:tplc="08090005" w:tentative="1">
+      <w:start w:val="1"/>
+      <w:numFmt w:val="bullet"/>
+      <w:lvlText w:val=""/>
+      <w:lvlJc w:val="left"/>
+      <w:pPr>
+        <w:ind w:left="6480" w:hanging="360"/>
+      </w:pPr>
+      <w:rPr>
+        <w:rFonts w:ascii="Wingdings" w:hAnsi="Wingdings" w:hint="default"/>
+      </w:rPr>
+    </w:lvl>
+  </w:abstractNum>
+  <w:abstractNum w:abstractNumId="15" w15:restartNumberingAfterBreak="0">
+    <w:nsid w:val="6A754960"/>
+    <w:multiLevelType w:val="multilevel"/>
+    <w:tmpl w:val="75EA1BB8"/>
+    <w:lvl w:ilvl="0">
+      <w:start w:val="1"/>
+      <w:numFmt w:val="bullet"/>
+      <w:lvlText w:val=""/>
+      <w:lvlJc w:val="left"/>
+      <w:pPr>
+        <w:tabs>
+          <w:tab w:val="num" w:pos="720"/>
+        </w:tabs>
+        <w:ind w:left="720" w:hanging="360"/>
+      </w:pPr>
+      <w:rPr>
+        <w:rFonts w:ascii="Symbol" w:hAnsi="Symbol" w:hint="default"/>
+        <w:sz w:val="20"/>
+      </w:rPr>
+    </w:lvl>
+    <w:lvl w:ilvl="1" w:tentative="1">
+      <w:start w:val="1"/>
+      <w:numFmt w:val="bullet"/>
+      <w:lvlText w:val="o"/>
+      <w:lvlJc w:val="left"/>
+      <w:pPr>
+        <w:tabs>
+          <w:tab w:val="num" w:pos="1440"/>
+        </w:tabs>
+        <w:ind w:left="1440" w:hanging="360"/>
+      </w:pPr>
+      <w:rPr>
+        <w:rFonts w:ascii="Courier New" w:hAnsi="Courier New" w:hint="default"/>
+        <w:sz w:val="20"/>
+      </w:rPr>
+    </w:lvl>
+    <w:lvl w:ilvl="2" w:tentative="1">
+      <w:start w:val="1"/>
+      <w:numFmt w:val="bullet"/>
+      <w:lvlText w:val=""/>
+      <w:lvlJc w:val="left"/>
+      <w:pPr>
+        <w:tabs>
+          <w:tab w:val="num" w:pos="2160"/>
+        </w:tabs>
+        <w:ind w:left="2160" w:hanging="360"/>
+      </w:pPr>
+      <w:rPr>
+        <w:rFonts w:ascii="Wingdings" w:hAnsi="Wingdings" w:hint="default"/>
+        <w:sz w:val="20"/>
+      </w:rPr>
+    </w:lvl>
+    <w:lvl w:ilvl="3" w:tentative="1">
+      <w:start w:val="1"/>
+      <w:numFmt w:val="bullet"/>
+      <w:lvlText w:val=""/>
+      <w:lvlJc w:val="left"/>
+      <w:pPr>
+        <w:tabs>
+          <w:tab w:val="num" w:pos="2880"/>
+        </w:tabs>
+        <w:ind w:left="2880" w:hanging="360"/>
+      </w:pPr>
+      <w:rPr>
+        <w:rFonts w:ascii="Wingdings" w:hAnsi="Wingdings" w:hint="default"/>
+        <w:sz w:val="20"/>
+      </w:rPr>
+    </w:lvl>
+    <w:lvl w:ilvl="4" w:tentative="1">
+      <w:start w:val="1"/>
+      <w:numFmt w:val="bullet"/>
+      <w:lvlText w:val=""/>
+      <w:lvlJc w:val="left"/>
+      <w:pPr>
+        <w:tabs>
+          <w:tab w:val="num" w:pos="3600"/>
+        </w:tabs>
+        <w:ind w:left="3600" w:hanging="360"/>
+      </w:pPr>
+      <w:rPr>
+        <w:rFonts w:ascii="Wingdings" w:hAnsi="Wingdings" w:hint="default"/>
+        <w:sz w:val="20"/>
+      </w:rPr>
+    </w:lvl>
+    <w:lvl w:ilvl="5" w:tentative="1">
+      <w:start w:val="1"/>
+      <w:numFmt w:val="bullet"/>
+      <w:lvlText w:val=""/>
+      <w:lvlJc w:val="left"/>
+      <w:pPr>
+        <w:tabs>
+          <w:tab w:val="num" w:pos="4320"/>
+        </w:tabs>
+        <w:ind w:left="4320" w:hanging="360"/>
+      </w:pPr>
+      <w:rPr>
+        <w:rFonts w:ascii="Wingdings" w:hAnsi="Wingdings" w:hint="default"/>
+        <w:sz w:val="20"/>
+      </w:rPr>
+    </w:lvl>
+    <w:lvl w:ilvl="6" w:tentative="1">
+      <w:start w:val="1"/>
+      <w:numFmt w:val="bullet"/>
+      <w:lvlText w:val=""/>
+      <w:lvlJc w:val="left"/>
+      <w:pPr>
+        <w:tabs>
+          <w:tab w:val="num" w:pos="5040"/>
+        </w:tabs>
+        <w:ind w:left="5040" w:hanging="360"/>
+      </w:pPr>
+      <w:rPr>
+        <w:rFonts w:ascii="Wingdings" w:hAnsi="Wingdings" w:hint="default"/>
+        <w:sz w:val="20"/>
+      </w:rPr>
+    </w:lvl>
+    <w:lvl w:ilvl="7" w:tentative="1">
+      <w:start w:val="1"/>
+      <w:numFmt w:val="bullet"/>
+      <w:lvlText w:val=""/>
+      <w:lvlJc w:val="left"/>
+      <w:pPr>
+        <w:tabs>
+          <w:tab w:val="num" w:pos="5760"/>
+        </w:tabs>
+        <w:ind w:left="5760" w:hanging="360"/>
+      </w:pPr>
+      <w:rPr>
+        <w:rFonts w:ascii="Wingdings" w:hAnsi="Wingdings" w:hint="default"/>
+        <w:sz w:val="20"/>
+      </w:rPr>
+    </w:lvl>
+    <w:lvl w:ilvl="8" w:tentative="1">
+      <w:start w:val="1"/>
+      <w:numFmt w:val="bullet"/>
+      <w:lvlText w:val=""/>
+      <w:lvlJc w:val="left"/>
+      <w:pPr>
+        <w:tabs>
+          <w:tab w:val="num" w:pos="6480"/>
+        </w:tabs>
+        <w:ind w:left="6480" w:hanging="360"/>
+      </w:pPr>
+      <w:rPr>
+        <w:rFonts w:ascii="Wingdings" w:hAnsi="Wingdings" w:hint="default"/>
+        <w:sz w:val="20"/>
+      </w:rPr>
+    </w:lvl>
+  </w:abstractNum>
+  <w:abstractNum w:abstractNumId="16" w15:restartNumberingAfterBreak="0">
+    <w:nsid w:val="6FE75004"/>
+    <w:multiLevelType w:val="hybridMultilevel"/>
+    <w:tmpl w:val="D9345060"/>
+    <w:lvl w:ilvl="0" w:tplc="08090001">
+      <w:start w:val="1"/>
+      <w:numFmt w:val="bullet"/>
+      <w:lvlText w:val=""/>
+      <w:lvlJc w:val="left"/>
+      <w:pPr>
+        <w:ind w:left="720" w:hanging="360"/>
+      </w:pPr>
+      <w:rPr>
+        <w:rFonts w:ascii="Symbol" w:hAnsi="Symbol" w:hint="default"/>
+      </w:rPr>
+    </w:lvl>
+    <w:lvl w:ilvl="1" w:tplc="08090003" w:tentative="1">
+      <w:start w:val="1"/>
+      <w:numFmt w:val="bullet"/>
+      <w:lvlText w:val="o"/>
+      <w:lvlJc w:val="left"/>
+      <w:pPr>
+        <w:ind w:left="1440" w:hanging="360"/>
+      </w:pPr>
+      <w:rPr>
+        <w:rFonts w:ascii="Courier New" w:hAnsi="Courier New" w:hint="default"/>
+      </w:rPr>
+    </w:lvl>
+    <w:lvl w:ilvl="2" w:tplc="08090005" w:tentative="1">
+      <w:start w:val="1"/>
+      <w:numFmt w:val="bullet"/>
+      <w:lvlText w:val=""/>
+      <w:lvlJc w:val="left"/>
+      <w:pPr>
+        <w:ind w:left="2160" w:hanging="360"/>
+      </w:pPr>
+      <w:rPr>
+        <w:rFonts w:ascii="Wingdings" w:hAnsi="Wingdings" w:hint="default"/>
+      </w:rPr>
+    </w:lvl>
+    <w:lvl w:ilvl="3" w:tplc="08090001" w:tentative="1">
+      <w:start w:val="1"/>
+      <w:numFmt w:val="bullet"/>
+      <w:lvlText w:val=""/>
+      <w:lvlJc w:val="left"/>
+      <w:pPr>
+        <w:ind w:left="2880" w:hanging="360"/>
+      </w:pPr>
+      <w:rPr>
+        <w:rFonts w:ascii="Symbol" w:hAnsi="Symbol" w:hint="default"/>
+      </w:rPr>
+    </w:lvl>
+    <w:lvl w:ilvl="4" w:tplc="08090003" w:tentative="1">
+      <w:start w:val="1"/>
+      <w:numFmt w:val="bullet"/>
+      <w:lvlText w:val="o"/>
+      <w:lvlJc w:val="left"/>
+      <w:pPr>
+        <w:ind w:left="3600" w:hanging="360"/>
+      </w:pPr>
+      <w:rPr>
+        <w:rFonts w:ascii="Courier New" w:hAnsi="Courier New" w:hint="default"/>
+      </w:rPr>
+    </w:lvl>
+    <w:lvl w:ilvl="5" w:tplc="08090005" w:tentative="1">
+      <w:start w:val="1"/>
+      <w:numFmt w:val="bullet"/>
+      <w:lvlText w:val=""/>
+      <w:lvlJc w:val="left"/>
+      <w:pPr>
+        <w:ind w:left="4320" w:hanging="360"/>
+      </w:pPr>
+      <w:rPr>
+        <w:rFonts w:ascii="Wingdings" w:hAnsi="Wingdings" w:hint="default"/>
+      </w:rPr>
+    </w:lvl>
+    <w:lvl w:ilvl="6" w:tplc="08090001" w:tentative="1">
+      <w:start w:val="1"/>
+      <w:numFmt w:val="bullet"/>
+      <w:lvlText w:val=""/>
+      <w:lvlJc w:val="left"/>
+      <w:pPr>
+        <w:ind w:left="5040" w:hanging="360"/>
+      </w:pPr>
+      <w:rPr>
+        <w:rFonts w:ascii="Symbol" w:hAnsi="Symbol" w:hint="default"/>
+      </w:rPr>
+    </w:lvl>
+    <w:lvl w:ilvl="7" w:tplc="08090003" w:tentative="1">
+      <w:start w:val="1"/>
+      <w:numFmt w:val="bullet"/>
+      <w:lvlText w:val="o"/>
+      <w:lvlJc w:val="left"/>
+      <w:pPr>
+        <w:ind w:left="5760" w:hanging="360"/>
+      </w:pPr>
+      <w:rPr>
+        <w:rFonts w:ascii="Courier New" w:hAnsi="Courier New" w:hint="default"/>
+      </w:rPr>
+    </w:lvl>
+    <w:lvl w:ilvl="8" w:tplc="08090005" w:tentative="1">
+      <w:start w:val="1"/>
+      <w:numFmt w:val="bullet"/>
+      <w:lvlText w:val=""/>
+      <w:lvlJc w:val="left"/>
+      <w:pPr>
+        <w:ind w:left="6480" w:hanging="360"/>
+      </w:pPr>
+      <w:rPr>
+        <w:rFonts w:ascii="Wingdings" w:hAnsi="Wingdings" w:hint="default"/>
+      </w:rPr>
+    </w:lvl>
+  </w:abstractNum>
+  <w:abstractNum w:abstractNumId="17" w15:restartNumberingAfterBreak="0">
+    <w:nsid w:val="782C05D0"/>
+    <w:multiLevelType w:val="hybridMultilevel"/>
+    <w:tmpl w:val="6172D506"/>
+    <w:lvl w:ilvl="0" w:tplc="BE3C934C">
+      <w:numFmt w:val="bullet"/>
+      <w:lvlText w:val=""/>
+      <w:lvlJc w:val="left"/>
+      <w:pPr>
+        <w:ind w:left="720" w:hanging="360"/>
+      </w:pPr>
+      <w:rPr>
+        <w:rFonts w:ascii="Aptos" w:eastAsia="Times New Roman" w:hAnsi="Aptos" w:cs="Times New Roman" w:hint="default"/>
+      </w:rPr>
+    </w:lvl>
+    <w:lvl w:ilvl="1" w:tplc="08090003" w:tentative="1">
+      <w:start w:val="1"/>
+      <w:numFmt w:val="bullet"/>
+      <w:lvlText w:val="o"/>
+      <w:lvlJc w:val="left"/>
+      <w:pPr>
+        <w:ind w:left="1440" w:hanging="360"/>
+      </w:pPr>
+      <w:rPr>
+        <w:rFonts w:ascii="Courier New" w:hAnsi="Courier New" w:hint="default"/>
+      </w:rPr>
+    </w:lvl>
+    <w:lvl w:ilvl="2" w:tplc="08090005" w:tentative="1">
+      <w:start w:val="1"/>
+      <w:numFmt w:val="bullet"/>
+      <w:lvlText w:val=""/>
+      <w:lvlJc w:val="left"/>
+      <w:pPr>
+        <w:ind w:left="2160" w:hanging="360"/>
+      </w:pPr>
+      <w:rPr>
+        <w:rFonts w:ascii="Wingdings" w:hAnsi="Wingdings" w:hint="default"/>
+      </w:rPr>
+    </w:lvl>
+    <w:lvl w:ilvl="3" w:tplc="08090001" w:tentative="1">
+      <w:start w:val="1"/>
+      <w:numFmt w:val="bullet"/>
+      <w:lvlText w:val=""/>
+      <w:lvlJc w:val="left"/>
+      <w:pPr>
+        <w:ind w:left="2880" w:hanging="360"/>
+      </w:pPr>
+      <w:rPr>
+        <w:rFonts w:ascii="Symbol" w:hAnsi="Symbol" w:hint="default"/>
+      </w:rPr>
+    </w:lvl>
+    <w:lvl w:ilvl="4" w:tplc="08090003" w:tentative="1">
+      <w:start w:val="1"/>
+      <w:numFmt w:val="bullet"/>
+      <w:lvlText w:val="o"/>
+      <w:lvlJc w:val="left"/>
+      <w:pPr>
+        <w:ind w:left="3600" w:hanging="360"/>
+      </w:pPr>
+      <w:rPr>
+        <w:rFonts w:ascii="Courier New" w:hAnsi="Courier New" w:hint="default"/>
+      </w:rPr>
+    </w:lvl>
+    <w:lvl w:ilvl="5" w:tplc="08090005" w:tentative="1">
+      <w:start w:val="1"/>
+      <w:numFmt w:val="bullet"/>
+      <w:lvlText w:val=""/>
+      <w:lvlJc w:val="left"/>
+      <w:pPr>
+        <w:ind w:left="4320" w:hanging="360"/>
+      </w:pPr>
+      <w:rPr>
+        <w:rFonts w:ascii="Wingdings" w:hAnsi="Wingdings" w:hint="default"/>
+      </w:rPr>
+    </w:lvl>
+    <w:lvl w:ilvl="6" w:tplc="08090001" w:tentative="1">
+      <w:start w:val="1"/>
+      <w:numFmt w:val="bullet"/>
+      <w:lvlText w:val=""/>
+      <w:lvlJc w:val="left"/>
+      <w:pPr>
+        <w:ind w:left="5040" w:hanging="360"/>
+      </w:pPr>
+      <w:rPr>
+        <w:rFonts w:ascii="Symbol" w:hAnsi="Symbol" w:hint="default"/>
+      </w:rPr>
+    </w:lvl>
+    <w:lvl w:ilvl="7" w:tplc="08090003" w:tentative="1">
+      <w:start w:val="1"/>
+      <w:numFmt w:val="bullet"/>
+      <w:lvlText w:val="o"/>
+      <w:lvlJc w:val="left"/>
+      <w:pPr>
+        <w:ind w:left="5760" w:hanging="360"/>
+      </w:pPr>
+      <w:rPr>
+        <w:rFonts w:ascii="Courier New" w:hAnsi="Courier New" w:hint="default"/>
+      </w:rPr>
+    </w:lvl>
+    <w:lvl w:ilvl="8" w:tplc="08090005" w:tentative="1">
+      <w:start w:val="1"/>
+      <w:numFmt w:val="bullet"/>
+      <w:lvlText w:val=""/>
+      <w:lvlJc w:val="left"/>
+      <w:pPr>
+        <w:ind w:left="6480" w:hanging="360"/>
+      </w:pPr>
+      <w:rPr>
+        <w:rFonts w:ascii="Wingdings" w:hAnsi="Wingdings" w:hint="default"/>
+      </w:rPr>
+    </w:lvl>
+  </w:abstractNum>
   <w:num w:numId="1" w16cid:durableId="44647069">
     <w:abstractNumId w:val="8"/>
   </w:num>
@@ -2339,6 +3580,33 @@
   </w:num>
   <w:num w:numId="9" w16cid:durableId="547031698">
     <w:abstractNumId w:val="0"/>
+  </w:num>
+  <w:num w:numId="10" w16cid:durableId="1696615163">
+    <w:abstractNumId w:val="12"/>
+  </w:num>
+  <w:num w:numId="11" w16cid:durableId="1320964643">
+    <w:abstractNumId w:val="14"/>
+  </w:num>
+  <w:num w:numId="12" w16cid:durableId="1081027528">
+    <w:abstractNumId w:val="17"/>
+  </w:num>
+  <w:num w:numId="13" w16cid:durableId="2062973200">
+    <w:abstractNumId w:val="9"/>
+  </w:num>
+  <w:num w:numId="14" w16cid:durableId="9721183">
+    <w:abstractNumId w:val="16"/>
+  </w:num>
+  <w:num w:numId="15" w16cid:durableId="1861889038">
+    <w:abstractNumId w:val="13"/>
+  </w:num>
+  <w:num w:numId="16" w16cid:durableId="1328828907">
+    <w:abstractNumId w:val="11"/>
+  </w:num>
+  <w:num w:numId="17" w16cid:durableId="1631860208">
+    <w:abstractNumId w:val="15"/>
+  </w:num>
+  <w:num w:numId="18" w16cid:durableId="31000715">
+    <w:abstractNumId w:val="10"/>
   </w:num>
 </w:numbering>
 </file>
@@ -13723,6 +14991,36 @@
       </w:tcPr>
     </w:tblStylePr>
   </w:style>
+  <w:style w:type="paragraph" w:styleId="NormalWeb">
+    <w:name w:val="Normal (Web)"/>
+    <w:basedOn w:val="Normal"/>
+    <w:uiPriority w:val="99"/>
+    <w:semiHidden/>
+    <w:unhideWhenUsed/>
+    <w:rsid w:val="00744ADB"/>
+    <w:pPr>
+      <w:spacing w:before="100" w:beforeAutospacing="1" w:after="100" w:afterAutospacing="1" w:line="240" w:lineRule="auto"/>
+    </w:pPr>
+    <w:rPr>
+      <w:rFonts w:ascii="Times New Roman" w:eastAsia="Times New Roman" w:hAnsi="Times New Roman" w:cs="Times New Roman"/>
+      <w:sz w:val="24"/>
+      <w:szCs w:val="24"/>
+      <w:lang w:val="en-IN" w:eastAsia="en-GB"/>
+    </w:rPr>
+  </w:style>
+  <w:style w:type="character" w:styleId="HTMLCode">
+    <w:name w:val="HTML Code"/>
+    <w:basedOn w:val="DefaultParagraphFont"/>
+    <w:uiPriority w:val="99"/>
+    <w:semiHidden/>
+    <w:unhideWhenUsed/>
+    <w:rsid w:val="00AB5260"/>
+    <w:rPr>
+      <w:rFonts w:ascii="Courier New" w:eastAsia="Times New Roman" w:hAnsi="Courier New" w:cs="Courier New"/>
+      <w:sz w:val="20"/>
+      <w:szCs w:val="20"/>
+    </w:rPr>
+  </w:style>
 </w:styles>
 </file>
 

</xml_diff>